<commit_message>
Update Mains and MCQ PDF formatting
</commit_message>
<xml_diff>
--- a/prompts/prompt v3.0.docx
+++ b/prompts/prompt v3.0.docx
@@ -7,23 +7,19 @@
         <w:spacing w:before="100" w:beforeAutospacing="1" w:after="100" w:afterAutospacing="1" w:line="240" w:lineRule="auto"/>
         <w:outlineLvl w:val="0"/>
         <w:rPr>
-          <w:rFonts w:ascii="Times New Roman" w:eastAsia="Times New Roman" w:hAnsi="Times New Roman" w:cs="Times New Roman"/>
+          <w:rFonts w:eastAsia="Times New Roman" w:cstheme="minorHAnsi"/>
           <w:b/>
           <w:bCs/>
           <w:kern w:val="36"/>
-          <w:sz w:val="48"/>
-          <w:szCs w:val="48"/>
-          <w:lang w:eastAsia="en-IN"/>
-        </w:rPr>
-      </w:pPr>
-      <w:r>
-        <w:rPr>
-          <w:rFonts w:ascii="Times New Roman" w:eastAsia="Times New Roman" w:hAnsi="Times New Roman" w:cs="Times New Roman"/>
+          <w:lang w:eastAsia="en-IN"/>
+        </w:rPr>
+      </w:pPr>
+      <w:r>
+        <w:rPr>
+          <w:rFonts w:eastAsia="Times New Roman" w:cstheme="minorHAnsi"/>
           <w:b/>
           <w:bCs/>
           <w:kern w:val="36"/>
-          <w:sz w:val="48"/>
-          <w:szCs w:val="48"/>
           <w:lang w:eastAsia="en-IN"/>
         </w:rPr>
         <w:t>INTERACTIVE UPSC EDITORIAL CONTENT GENERATOR — MASTER PROMPT</w:t>
@@ -33,68 +29,54 @@
       <w:pPr>
         <w:spacing w:before="100" w:beforeAutospacing="1" w:after="100" w:afterAutospacing="1" w:line="240" w:lineRule="auto"/>
         <w:rPr>
-          <w:rFonts w:ascii="Times New Roman" w:eastAsia="Times New Roman" w:hAnsi="Times New Roman" w:cs="Times New Roman"/>
-          <w:sz w:val="24"/>
-          <w:szCs w:val="24"/>
-          <w:lang w:eastAsia="en-IN"/>
-        </w:rPr>
-      </w:pPr>
-      <w:r>
-        <w:rPr>
-          <w:rFonts w:ascii="Times New Roman" w:eastAsia="Times New Roman" w:hAnsi="Times New Roman" w:cs="Times New Roman"/>
-          <w:sz w:val="24"/>
-          <w:szCs w:val="24"/>
+          <w:rFonts w:eastAsia="Times New Roman" w:cstheme="minorHAnsi"/>
+          <w:lang w:eastAsia="en-IN"/>
+        </w:rPr>
+      </w:pPr>
+      <w:r>
+        <w:rPr>
+          <w:rFonts w:eastAsia="Times New Roman" w:cstheme="minorHAnsi"/>
           <w:lang w:eastAsia="en-IN"/>
         </w:rPr>
         <w:t xml:space="preserve">You are a senior UPSC educator, curriculum designer and examination mentor. Your task is to transform </w:t>
       </w:r>
       <w:r>
         <w:rPr>
-          <w:rFonts w:ascii="Times New Roman" w:eastAsia="Times New Roman" w:hAnsi="Times New Roman" w:cs="Times New Roman"/>
-          <w:b/>
-          <w:bCs/>
-          <w:sz w:val="24"/>
-          <w:szCs w:val="24"/>
+          <w:rFonts w:eastAsia="Times New Roman" w:cstheme="minorHAnsi"/>
+          <w:b/>
+          <w:bCs/>
           <w:lang w:eastAsia="en-IN"/>
         </w:rPr>
         <w:t>one newspaper editorial at a time</w:t>
       </w:r>
       <w:r>
         <w:rPr>
-          <w:rFonts w:ascii="Times New Roman" w:eastAsia="Times New Roman" w:hAnsi="Times New Roman" w:cs="Times New Roman"/>
-          <w:sz w:val="24"/>
-          <w:szCs w:val="24"/>
+          <w:rFonts w:eastAsia="Times New Roman" w:cstheme="minorHAnsi"/>
           <w:lang w:eastAsia="en-IN"/>
         </w:rPr>
         <w:t xml:space="preserve"> into original, concept-oriented, examination-focused UPSC study material. Treat the editorial only as a source of knowledge; never copy, closely paraphrase, or imitate its wording, structure, style or arguments. If no editorial is provided, ask only: </w:t>
       </w:r>
       <w:r>
         <w:rPr>
-          <w:rFonts w:ascii="Times New Roman" w:eastAsia="Times New Roman" w:hAnsi="Times New Roman" w:cs="Times New Roman"/>
-          <w:b/>
-          <w:bCs/>
-          <w:sz w:val="24"/>
-          <w:szCs w:val="24"/>
+          <w:rFonts w:eastAsia="Times New Roman" w:cstheme="minorHAnsi"/>
+          <w:b/>
+          <w:bCs/>
           <w:lang w:eastAsia="en-IN"/>
         </w:rPr>
         <w:t>“Please paste the editorial.”</w:t>
       </w:r>
       <w:r>
         <w:rPr>
-          <w:rFonts w:ascii="Times New Roman" w:eastAsia="Times New Roman" w:hAnsi="Times New Roman" w:cs="Times New Roman"/>
-          <w:sz w:val="24"/>
-          <w:szCs w:val="24"/>
+          <w:rFonts w:eastAsia="Times New Roman" w:cstheme="minorHAnsi"/>
           <w:lang w:eastAsia="en-IN"/>
         </w:rPr>
         <w:t xml:space="preserve"> Do not analyse or generate anything until the editorial is pasted. After receiving it, read and understand the complete editorial before beginning the following interactive workflow. </w:t>
       </w:r>
       <w:r>
         <w:rPr>
-          <w:rFonts w:ascii="Times New Roman" w:eastAsia="Times New Roman" w:hAnsi="Times New Roman" w:cs="Times New Roman"/>
-          <w:b/>
-          <w:bCs/>
-          <w:sz w:val="24"/>
-          <w:szCs w:val="24"/>
+          <w:rFonts w:eastAsia="Times New Roman" w:cstheme="minorHAnsi"/>
+          <w:b/>
+          <w:bCs/>
           <w:lang w:eastAsia="en-IN"/>
         </w:rPr>
         <w:t>Do not skip stages, do not generate later stages early, and wait for the user's selection at every stage.</w:t>
@@ -104,68 +86,54 @@
       <w:pPr>
         <w:spacing w:before="100" w:beforeAutospacing="1" w:after="100" w:afterAutospacing="1" w:line="240" w:lineRule="auto"/>
         <w:rPr>
-          <w:rFonts w:ascii="Times New Roman" w:eastAsia="Times New Roman" w:hAnsi="Times New Roman" w:cs="Times New Roman"/>
-          <w:sz w:val="24"/>
-          <w:szCs w:val="24"/>
-          <w:lang w:eastAsia="en-IN"/>
-        </w:rPr>
-      </w:pPr>
-      <w:r>
-        <w:rPr>
-          <w:rFonts w:ascii="Times New Roman" w:eastAsia="Times New Roman" w:hAnsi="Times New Roman" w:cs="Times New Roman"/>
-          <w:b/>
-          <w:bCs/>
-          <w:sz w:val="24"/>
-          <w:szCs w:val="24"/>
+          <w:rFonts w:eastAsia="Times New Roman" w:cstheme="minorHAnsi"/>
+          <w:lang w:eastAsia="en-IN"/>
+        </w:rPr>
+      </w:pPr>
+      <w:r>
+        <w:rPr>
+          <w:rFonts w:eastAsia="Times New Roman" w:cstheme="minorHAnsi"/>
+          <w:b/>
+          <w:bCs/>
           <w:lang w:eastAsia="en-IN"/>
         </w:rPr>
         <w:t>STAGE 1 — TODAY'S QUESTION:</w:t>
       </w:r>
       <w:r>
         <w:rPr>
-          <w:rFonts w:ascii="Times New Roman" w:eastAsia="Times New Roman" w:hAnsi="Times New Roman" w:cs="Times New Roman"/>
-          <w:sz w:val="24"/>
-          <w:szCs w:val="24"/>
+          <w:rFonts w:eastAsia="Times New Roman" w:cstheme="minorHAnsi"/>
           <w:lang w:eastAsia="en-IN"/>
         </w:rPr>
         <w:t xml:space="preserve"> Generate </w:t>
       </w:r>
       <w:r>
         <w:rPr>
-          <w:rFonts w:ascii="Times New Roman" w:eastAsia="Times New Roman" w:hAnsi="Times New Roman" w:cs="Times New Roman"/>
-          <w:b/>
-          <w:bCs/>
-          <w:sz w:val="24"/>
-          <w:szCs w:val="24"/>
+          <w:rFonts w:eastAsia="Times New Roman" w:cstheme="minorHAnsi"/>
+          <w:b/>
+          <w:bCs/>
           <w:lang w:eastAsia="en-IN"/>
         </w:rPr>
         <w:t>2 distinct curiosity-driven UPSC questions</w:t>
       </w:r>
       <w:r>
         <w:rPr>
-          <w:rFonts w:ascii="Times New Roman" w:eastAsia="Times New Roman" w:hAnsi="Times New Roman" w:cs="Times New Roman"/>
-          <w:sz w:val="24"/>
-          <w:szCs w:val="24"/>
+          <w:rFonts w:eastAsia="Times New Roman" w:cstheme="minorHAnsi"/>
           <w:lang w:eastAsia="en-IN"/>
         </w:rPr>
         <w:t xml:space="preserve"> based on the editorial and its broader educational issue. Show: </w:t>
       </w:r>
       <w:r>
         <w:rPr>
-          <w:rFonts w:ascii="Times New Roman" w:eastAsia="Times New Roman" w:hAnsi="Times New Roman" w:cs="Times New Roman"/>
-          <w:b/>
-          <w:bCs/>
-          <w:sz w:val="24"/>
-          <w:szCs w:val="24"/>
+          <w:rFonts w:eastAsia="Times New Roman" w:cstheme="minorHAnsi"/>
+          <w:b/>
+          <w:bCs/>
           <w:lang w:eastAsia="en-IN"/>
         </w:rPr>
         <w:t>“TODAY'S QUESTION — SELECT 1 OF 2 | Word limit: 12–16 words.”</w:t>
       </w:r>
       <w:r>
         <w:rPr>
-          <w:rFonts w:ascii="Times New Roman" w:eastAsia="Times New Roman" w:hAnsi="Times New Roman" w:cs="Times New Roman"/>
-          <w:sz w:val="24"/>
-          <w:szCs w:val="24"/>
+          <w:rFonts w:eastAsia="Times New Roman" w:cstheme="minorHAnsi"/>
           <w:lang w:eastAsia="en-IN"/>
         </w:rPr>
         <w:t xml:space="preserve"> Complete each question first, </w:t>
@@ -173,9 +141,7 @@
       <w:proofErr w:type="gramStart"/>
       <w:r>
         <w:rPr>
-          <w:rFonts w:ascii="Times New Roman" w:eastAsia="Times New Roman" w:hAnsi="Times New Roman" w:cs="Times New Roman"/>
-          <w:sz w:val="24"/>
-          <w:szCs w:val="24"/>
+          <w:rFonts w:eastAsia="Times New Roman" w:cstheme="minorHAnsi"/>
           <w:lang w:eastAsia="en-IN"/>
         </w:rPr>
         <w:t>then</w:t>
@@ -183,9 +149,7 @@
       <w:proofErr w:type="gramEnd"/>
       <w:r>
         <w:rPr>
-          <w:rFonts w:ascii="Times New Roman" w:eastAsia="Times New Roman" w:hAnsi="Times New Roman" w:cs="Times New Roman"/>
-          <w:sz w:val="24"/>
-          <w:szCs w:val="24"/>
+          <w:rFonts w:eastAsia="Times New Roman" w:cstheme="minorHAnsi"/>
           <w:lang w:eastAsia="en-IN"/>
         </w:rPr>
         <w:t xml:space="preserve"> display its metadata in brackets, including its exact word count. The metadata is for selection only and must never appear in the final output. After the user selects one, store the clean selected question.</w:t>
@@ -195,252 +159,202 @@
       <w:pPr>
         <w:spacing w:before="100" w:beforeAutospacing="1" w:after="100" w:afterAutospacing="1" w:line="240" w:lineRule="auto"/>
         <w:rPr>
-          <w:rFonts w:ascii="Times New Roman" w:eastAsia="Times New Roman" w:hAnsi="Times New Roman" w:cs="Times New Roman"/>
-          <w:sz w:val="24"/>
-          <w:szCs w:val="24"/>
-          <w:lang w:eastAsia="en-IN"/>
-        </w:rPr>
-      </w:pPr>
-      <w:r>
-        <w:rPr>
-          <w:rFonts w:ascii="Times New Roman" w:eastAsia="Times New Roman" w:hAnsi="Times New Roman" w:cs="Times New Roman"/>
-          <w:b/>
-          <w:bCs/>
-          <w:sz w:val="24"/>
-          <w:szCs w:val="24"/>
+          <w:rFonts w:eastAsia="Times New Roman" w:cstheme="minorHAnsi"/>
+          <w:lang w:eastAsia="en-IN"/>
+        </w:rPr>
+      </w:pPr>
+      <w:r>
+        <w:rPr>
+          <w:rFonts w:eastAsia="Times New Roman" w:cstheme="minorHAnsi"/>
+          <w:b/>
+          <w:bCs/>
           <w:lang w:eastAsia="en-IN"/>
         </w:rPr>
         <w:t>STAGE 2 — KNOWLEDGE POINTS:</w:t>
       </w:r>
       <w:r>
         <w:rPr>
-          <w:rFonts w:ascii="Times New Roman" w:eastAsia="Times New Roman" w:hAnsi="Times New Roman" w:cs="Times New Roman"/>
-          <w:sz w:val="24"/>
-          <w:szCs w:val="24"/>
+          <w:rFonts w:eastAsia="Times New Roman" w:cstheme="minorHAnsi"/>
           <w:lang w:eastAsia="en-IN"/>
         </w:rPr>
         <w:t xml:space="preserve"> Based on the editorial and selected question, generate </w:t>
       </w:r>
       <w:r>
         <w:rPr>
-          <w:rFonts w:ascii="Times New Roman" w:eastAsia="Times New Roman" w:hAnsi="Times New Roman" w:cs="Times New Roman"/>
-          <w:b/>
-          <w:bCs/>
-          <w:sz w:val="24"/>
-          <w:szCs w:val="24"/>
+          <w:rFonts w:eastAsia="Times New Roman" w:cstheme="minorHAnsi"/>
+          <w:b/>
+          <w:bCs/>
           <w:lang w:eastAsia="en-IN"/>
         </w:rPr>
         <w:t>6-8</w:t>
       </w:r>
       <w:r>
         <w:rPr>
-          <w:rFonts w:ascii="Times New Roman" w:eastAsia="Times New Roman" w:hAnsi="Times New Roman" w:cs="Times New Roman"/>
-          <w:b/>
-          <w:bCs/>
-          <w:sz w:val="24"/>
-          <w:szCs w:val="24"/>
+          <w:rFonts w:eastAsia="Times New Roman" w:cstheme="minorHAnsi"/>
+          <w:b/>
+          <w:bCs/>
           <w:lang w:eastAsia="en-IN"/>
         </w:rPr>
         <w:t xml:space="preserve"> strong, distinct Knowledge Point options</w:t>
       </w:r>
       <w:r>
         <w:rPr>
-          <w:rFonts w:ascii="Times New Roman" w:eastAsia="Times New Roman" w:hAnsi="Times New Roman" w:cs="Times New Roman"/>
-          <w:sz w:val="24"/>
-          <w:szCs w:val="24"/>
+          <w:rFonts w:eastAsia="Times New Roman" w:cstheme="minorHAnsi"/>
           <w:lang w:eastAsia="en-IN"/>
         </w:rPr>
         <w:t xml:space="preserve">; fewer are acceptable if fewer genuinely useful points exist. Never repeat a concept or create weak variations merely to increase the number. Knowledge Points must primarily teach </w:t>
       </w:r>
       <w:r>
         <w:rPr>
-          <w:rFonts w:ascii="Times New Roman" w:eastAsia="Times New Roman" w:hAnsi="Times New Roman" w:cs="Times New Roman"/>
-          <w:b/>
-          <w:bCs/>
-          <w:sz w:val="24"/>
-          <w:szCs w:val="24"/>
+          <w:rFonts w:eastAsia="Times New Roman" w:cstheme="minorHAnsi"/>
+          <w:b/>
+          <w:bCs/>
           <w:lang w:eastAsia="en-IN"/>
         </w:rPr>
         <w:t>concepts, definitions, explanations, background, context, mechanisms, the editorial's core/crux, causes, implications, challenges, institutions, laws, constitutional dimensions or reforms</w:t>
       </w:r>
       <w:r>
         <w:rPr>
-          <w:rFonts w:ascii="Times New Roman" w:eastAsia="Times New Roman" w:hAnsi="Times New Roman" w:cs="Times New Roman"/>
-          <w:sz w:val="24"/>
-          <w:szCs w:val="24"/>
+          <w:rFonts w:eastAsia="Times New Roman" w:cstheme="minorHAnsi"/>
           <w:lang w:eastAsia="en-IN"/>
         </w:rPr>
         <w:t xml:space="preserve">. They must </w:t>
       </w:r>
       <w:r>
         <w:rPr>
-          <w:rFonts w:ascii="Times New Roman" w:eastAsia="Times New Roman" w:hAnsi="Times New Roman" w:cs="Times New Roman"/>
-          <w:b/>
-          <w:bCs/>
-          <w:sz w:val="24"/>
-          <w:szCs w:val="24"/>
+          <w:rFonts w:eastAsia="Times New Roman" w:cstheme="minorHAnsi"/>
+          <w:b/>
+          <w:bCs/>
           <w:lang w:eastAsia="en-IN"/>
         </w:rPr>
         <w:t>not become fact collections</w:t>
       </w:r>
       <w:r>
         <w:rPr>
-          <w:rFonts w:ascii="Times New Roman" w:eastAsia="Times New Roman" w:hAnsi="Times New Roman" w:cs="Times New Roman"/>
-          <w:sz w:val="24"/>
-          <w:szCs w:val="24"/>
+          <w:rFonts w:eastAsia="Times New Roman" w:cstheme="minorHAnsi"/>
           <w:lang w:eastAsia="en-IN"/>
         </w:rPr>
         <w:t xml:space="preserve">. At least </w:t>
       </w:r>
       <w:r>
         <w:rPr>
-          <w:rFonts w:ascii="Times New Roman" w:eastAsia="Times New Roman" w:hAnsi="Times New Roman" w:cs="Times New Roman"/>
-          <w:b/>
-          <w:bCs/>
-          <w:sz w:val="24"/>
-          <w:szCs w:val="24"/>
+          <w:rFonts w:eastAsia="Times New Roman" w:cstheme="minorHAnsi"/>
+          <w:b/>
+          <w:bCs/>
           <w:lang w:eastAsia="en-IN"/>
         </w:rPr>
         <w:t>2 Knowledge Points must provide useful information beyond the editorial</w:t>
       </w:r>
       <w:r>
         <w:rPr>
-          <w:rFonts w:ascii="Times New Roman" w:eastAsia="Times New Roman" w:hAnsi="Times New Roman" w:cs="Times New Roman"/>
-          <w:sz w:val="24"/>
-          <w:szCs w:val="24"/>
+          <w:rFonts w:eastAsia="Times New Roman" w:cstheme="minorHAnsi"/>
           <w:lang w:eastAsia="en-IN"/>
         </w:rPr>
         <w:t xml:space="preserve">, such as basic definitions, background, concepts or explanations needed to understand the topic. Each option must have a </w:t>
       </w:r>
       <w:r>
         <w:rPr>
-          <w:rFonts w:ascii="Times New Roman" w:eastAsia="Times New Roman" w:hAnsi="Times New Roman" w:cs="Times New Roman"/>
-          <w:b/>
-          <w:bCs/>
-          <w:sz w:val="24"/>
-          <w:szCs w:val="24"/>
+          <w:rFonts w:eastAsia="Times New Roman" w:cstheme="minorHAnsi"/>
+          <w:b/>
+          <w:bCs/>
           <w:lang w:eastAsia="en-IN"/>
         </w:rPr>
         <w:t xml:space="preserve">2–4 word heading and a 25-30 </w:t>
       </w:r>
       <w:r>
         <w:rPr>
-          <w:rFonts w:ascii="Times New Roman" w:eastAsia="Times New Roman" w:hAnsi="Times New Roman" w:cs="Times New Roman"/>
-          <w:b/>
-          <w:bCs/>
-          <w:sz w:val="24"/>
-          <w:szCs w:val="24"/>
+          <w:rFonts w:eastAsia="Times New Roman" w:cstheme="minorHAnsi"/>
+          <w:b/>
+          <w:bCs/>
           <w:lang w:eastAsia="en-IN"/>
         </w:rPr>
         <w:t>word explanation</w:t>
       </w:r>
       <w:r>
         <w:rPr>
-          <w:rFonts w:ascii="Times New Roman" w:eastAsia="Times New Roman" w:hAnsi="Times New Roman" w:cs="Times New Roman"/>
-          <w:sz w:val="24"/>
-          <w:szCs w:val="24"/>
+          <w:rFonts w:eastAsia="Times New Roman" w:cstheme="minorHAnsi"/>
           <w:lang w:eastAsia="en-IN"/>
         </w:rPr>
         <w:t xml:space="preserve">. Show: </w:t>
       </w:r>
       <w:r>
         <w:rPr>
-          <w:rFonts w:ascii="Times New Roman" w:eastAsia="Times New Roman" w:hAnsi="Times New Roman" w:cs="Times New Roman"/>
-          <w:b/>
-          <w:bCs/>
-          <w:sz w:val="24"/>
-          <w:szCs w:val="24"/>
+          <w:rFonts w:eastAsia="Times New Roman" w:cstheme="minorHAnsi"/>
+          <w:b/>
+          <w:bCs/>
           <w:lang w:eastAsia="en-IN"/>
         </w:rPr>
         <w:t>“KNOWLEDGE POINTS — SELECT 5 OF X | Heading</w:t>
       </w:r>
       <w:r>
         <w:rPr>
-          <w:rFonts w:ascii="Times New Roman" w:eastAsia="Times New Roman" w:hAnsi="Times New Roman" w:cs="Times New Roman"/>
-          <w:b/>
-          <w:bCs/>
-          <w:sz w:val="24"/>
-          <w:szCs w:val="24"/>
+          <w:rFonts w:eastAsia="Times New Roman" w:cstheme="minorHAnsi"/>
+          <w:b/>
+          <w:bCs/>
           <w:lang w:eastAsia="en-IN"/>
         </w:rPr>
         <w:t>: 2–4 words | Explanation: 25-30</w:t>
       </w:r>
       <w:r>
         <w:rPr>
-          <w:rFonts w:ascii="Times New Roman" w:eastAsia="Times New Roman" w:hAnsi="Times New Roman" w:cs="Times New Roman"/>
-          <w:b/>
-          <w:bCs/>
-          <w:sz w:val="24"/>
-          <w:szCs w:val="24"/>
+          <w:rFonts w:eastAsia="Times New Roman" w:cstheme="minorHAnsi"/>
+          <w:b/>
+          <w:bCs/>
           <w:lang w:eastAsia="en-IN"/>
         </w:rPr>
         <w:t xml:space="preserve"> words.”</w:t>
       </w:r>
       <w:r>
         <w:rPr>
-          <w:rFonts w:ascii="Times New Roman" w:eastAsia="Times New Roman" w:hAnsi="Times New Roman" w:cs="Times New Roman"/>
-          <w:sz w:val="24"/>
-          <w:szCs w:val="24"/>
+          <w:rFonts w:eastAsia="Times New Roman" w:cstheme="minorHAnsi"/>
           <w:lang w:eastAsia="en-IN"/>
         </w:rPr>
         <w:t xml:space="preserve"> After every completed point, show its exact word count and source/type in brackets, such as </w:t>
       </w:r>
       <w:r>
         <w:rPr>
-          <w:rFonts w:ascii="Times New Roman" w:eastAsia="Times New Roman" w:hAnsi="Times New Roman" w:cs="Times New Roman"/>
-          <w:b/>
-          <w:bCs/>
-          <w:sz w:val="24"/>
-          <w:szCs w:val="24"/>
+          <w:rFonts w:eastAsia="Times New Roman" w:cstheme="minorHAnsi"/>
+          <w:b/>
+          <w:bCs/>
           <w:lang w:eastAsia="en-IN"/>
         </w:rPr>
         <w:t>[33 words | Editorial + Concept]</w:t>
       </w:r>
       <w:r>
         <w:rPr>
-          <w:rFonts w:ascii="Times New Roman" w:eastAsia="Times New Roman" w:hAnsi="Times New Roman" w:cs="Times New Roman"/>
-          <w:sz w:val="24"/>
-          <w:szCs w:val="24"/>
+          <w:rFonts w:eastAsia="Times New Roman" w:cstheme="minorHAnsi"/>
           <w:lang w:eastAsia="en-IN"/>
         </w:rPr>
         <w:t xml:space="preserve"> or </w:t>
       </w:r>
       <w:r>
         <w:rPr>
-          <w:rFonts w:ascii="Times New Roman" w:eastAsia="Times New Roman" w:hAnsi="Times New Roman" w:cs="Times New Roman"/>
-          <w:b/>
-          <w:bCs/>
-          <w:sz w:val="24"/>
-          <w:szCs w:val="24"/>
+          <w:rFonts w:eastAsia="Times New Roman" w:cstheme="minorHAnsi"/>
+          <w:b/>
+          <w:bCs/>
           <w:lang w:eastAsia="en-IN"/>
         </w:rPr>
         <w:t>[31 words | Background Concept]</w:t>
       </w:r>
       <w:r>
         <w:rPr>
-          <w:rFonts w:ascii="Times New Roman" w:eastAsia="Times New Roman" w:hAnsi="Times New Roman" w:cs="Times New Roman"/>
-          <w:sz w:val="24"/>
-          <w:szCs w:val="24"/>
+          <w:rFonts w:eastAsia="Times New Roman" w:cstheme="minorHAnsi"/>
           <w:lang w:eastAsia="en-IN"/>
         </w:rPr>
         <w:t xml:space="preserve">. The metadata must be placed </w:t>
       </w:r>
       <w:r>
         <w:rPr>
-          <w:rFonts w:ascii="Times New Roman" w:eastAsia="Times New Roman" w:hAnsi="Times New Roman" w:cs="Times New Roman"/>
-          <w:b/>
-          <w:bCs/>
-          <w:sz w:val="24"/>
-          <w:szCs w:val="24"/>
+          <w:rFonts w:eastAsia="Times New Roman" w:cstheme="minorHAnsi"/>
+          <w:b/>
+          <w:bCs/>
           <w:lang w:eastAsia="en-IN"/>
         </w:rPr>
         <w:t>after the completed content</w:t>
       </w:r>
       <w:r>
         <w:rPr>
-          <w:rFonts w:ascii="Times New Roman" w:eastAsia="Times New Roman" w:hAnsi="Times New Roman" w:cs="Times New Roman"/>
-          <w:sz w:val="24"/>
-          <w:szCs w:val="24"/>
+          <w:rFonts w:eastAsia="Times New Roman" w:cstheme="minorHAnsi"/>
           <w:lang w:eastAsia="en-IN"/>
         </w:rPr>
         <w:t>, is only for selection, and must be removed from the final output. Wait for the user's selection and store only the clean selected points.</w:t>
@@ -450,491 +364,387 @@
       <w:pPr>
         <w:spacing w:before="100" w:beforeAutospacing="1" w:after="100" w:afterAutospacing="1" w:line="240" w:lineRule="auto"/>
         <w:rPr>
-          <w:rFonts w:ascii="Times New Roman" w:eastAsia="Times New Roman" w:hAnsi="Times New Roman" w:cs="Times New Roman"/>
-          <w:sz w:val="24"/>
-          <w:szCs w:val="24"/>
-          <w:lang w:eastAsia="en-IN"/>
-        </w:rPr>
-      </w:pPr>
-      <w:r>
-        <w:rPr>
-          <w:rFonts w:ascii="Times New Roman" w:eastAsia="Times New Roman" w:hAnsi="Times New Roman" w:cs="Times New Roman"/>
-          <w:b/>
-          <w:bCs/>
-          <w:sz w:val="24"/>
-          <w:szCs w:val="24"/>
+          <w:rFonts w:eastAsia="Times New Roman" w:cstheme="minorHAnsi"/>
+          <w:lang w:eastAsia="en-IN"/>
+        </w:rPr>
+      </w:pPr>
+      <w:r>
+        <w:rPr>
+          <w:rFonts w:eastAsia="Times New Roman" w:cstheme="minorHAnsi"/>
+          <w:b/>
+          <w:bCs/>
           <w:lang w:eastAsia="en-IN"/>
         </w:rPr>
         <w:t>STAGE 3 — QUICK FACTS:</w:t>
       </w:r>
       <w:r>
         <w:rPr>
-          <w:rFonts w:ascii="Times New Roman" w:eastAsia="Times New Roman" w:hAnsi="Times New Roman" w:cs="Times New Roman"/>
-          <w:sz w:val="24"/>
-          <w:szCs w:val="24"/>
+          <w:rFonts w:eastAsia="Times New Roman" w:cstheme="minorHAnsi"/>
           <w:lang w:eastAsia="en-IN"/>
         </w:rPr>
         <w:t xml:space="preserve"> Generate </w:t>
       </w:r>
       <w:r>
         <w:rPr>
-          <w:rFonts w:ascii="Times New Roman" w:eastAsia="Times New Roman" w:hAnsi="Times New Roman" w:cs="Times New Roman"/>
-          <w:b/>
-          <w:bCs/>
-          <w:sz w:val="24"/>
-          <w:szCs w:val="24"/>
-          <w:lang w:eastAsia="en-IN"/>
-        </w:rPr>
-        <w:t>6</w:t>
-      </w:r>
-      <w:r>
-        <w:rPr>
-          <w:rFonts w:ascii="Times New Roman" w:eastAsia="Times New Roman" w:hAnsi="Times New Roman" w:cs="Times New Roman"/>
-          <w:b/>
-          <w:bCs/>
-          <w:sz w:val="24"/>
-          <w:szCs w:val="24"/>
-          <w:lang w:eastAsia="en-IN"/>
-        </w:rPr>
-        <w:t>-8</w:t>
-      </w:r>
-      <w:r>
-        <w:rPr>
-          <w:rFonts w:ascii="Times New Roman" w:eastAsia="Times New Roman" w:hAnsi="Times New Roman" w:cs="Times New Roman"/>
-          <w:b/>
-          <w:bCs/>
-          <w:sz w:val="24"/>
-          <w:szCs w:val="24"/>
+          <w:rFonts w:eastAsia="Times New Roman" w:cstheme="minorHAnsi"/>
+          <w:b/>
+          <w:bCs/>
+          <w:lang w:eastAsia="en-IN"/>
+        </w:rPr>
+        <w:t>4-6</w:t>
+      </w:r>
+      <w:r>
+        <w:rPr>
+          <w:rFonts w:eastAsia="Times New Roman" w:cstheme="minorHAnsi"/>
+          <w:b/>
+          <w:bCs/>
           <w:lang w:eastAsia="en-IN"/>
         </w:rPr>
         <w:t xml:space="preserve"> distinct Quick Fact options</w:t>
       </w:r>
       <w:r>
         <w:rPr>
-          <w:rFonts w:ascii="Times New Roman" w:eastAsia="Times New Roman" w:hAnsi="Times New Roman" w:cs="Times New Roman"/>
-          <w:sz w:val="24"/>
-          <w:szCs w:val="24"/>
+          <w:rFonts w:eastAsia="Times New Roman" w:cstheme="minorHAnsi"/>
           <w:lang w:eastAsia="en-IN"/>
         </w:rPr>
         <w:t xml:space="preserve">, or fewer if fewer genuinely useful facts exist. Quick Facts should contain </w:t>
       </w:r>
       <w:r>
         <w:rPr>
-          <w:rFonts w:ascii="Times New Roman" w:eastAsia="Times New Roman" w:hAnsi="Times New Roman" w:cs="Times New Roman"/>
-          <w:b/>
-          <w:bCs/>
-          <w:sz w:val="24"/>
-          <w:szCs w:val="24"/>
+          <w:rFonts w:eastAsia="Times New Roman" w:cstheme="minorHAnsi"/>
+          <w:b/>
+          <w:bCs/>
           <w:lang w:eastAsia="en-IN"/>
         </w:rPr>
         <w:t>facts, figures, dates, reports, judgments, schemes, institutional developments, statistics or other factual information</w:t>
       </w:r>
       <w:r>
         <w:rPr>
-          <w:rFonts w:ascii="Times New Roman" w:eastAsia="Times New Roman" w:hAnsi="Times New Roman" w:cs="Times New Roman"/>
-          <w:sz w:val="24"/>
-          <w:szCs w:val="24"/>
+          <w:rFonts w:eastAsia="Times New Roman" w:cstheme="minorHAnsi"/>
           <w:lang w:eastAsia="en-IN"/>
         </w:rPr>
         <w:t xml:space="preserve">, rather than conceptual explanations. First use useful factual information explicitly provided in the editorial. If the editorial does not contain enough useful facts, check </w:t>
       </w:r>
       <w:r>
         <w:rPr>
-          <w:rFonts w:ascii="Times New Roman" w:eastAsia="Times New Roman" w:hAnsi="Times New Roman" w:cs="Times New Roman"/>
-          <w:b/>
-          <w:bCs/>
-          <w:sz w:val="24"/>
-          <w:szCs w:val="24"/>
+          <w:rFonts w:eastAsia="Times New Roman" w:cstheme="minorHAnsi"/>
+          <w:b/>
+          <w:bCs/>
           <w:lang w:eastAsia="en-IN"/>
         </w:rPr>
         <w:t>verified current affairs from the previous 6 months</w:t>
       </w:r>
       <w:r>
         <w:rPr>
-          <w:rFonts w:ascii="Times New Roman" w:eastAsia="Times New Roman" w:hAnsi="Times New Roman" w:cs="Times New Roman"/>
-          <w:sz w:val="24"/>
-          <w:szCs w:val="24"/>
+          <w:rFonts w:eastAsia="Times New Roman" w:cstheme="minorHAnsi"/>
           <w:lang w:eastAsia="en-IN"/>
         </w:rPr>
         <w:t xml:space="preserve"> and select relevant facts. Do not force recent facts when they are not relevant. Prefer authoritative and official sources. Never invent or use unverified information. Show: </w:t>
       </w:r>
       <w:r>
         <w:rPr>
-          <w:rFonts w:ascii="Times New Roman" w:eastAsia="Times New Roman" w:hAnsi="Times New Roman" w:cs="Times New Roman"/>
-          <w:b/>
-          <w:bCs/>
-          <w:sz w:val="24"/>
-          <w:szCs w:val="24"/>
-          <w:lang w:eastAsia="en-IN"/>
-        </w:rPr>
-        <w:t>“QUICK FACTS — SELECT 4 OF X | Word limit: 20–30 words.”</w:t>
-      </w:r>
-      <w:r>
-        <w:rPr>
-          <w:rFonts w:ascii="Times New Roman" w:eastAsia="Times New Roman" w:hAnsi="Times New Roman" w:cs="Times New Roman"/>
-          <w:sz w:val="24"/>
-          <w:szCs w:val="24"/>
+          <w:rFonts w:eastAsia="Times New Roman" w:cstheme="minorHAnsi"/>
+          <w:b/>
+          <w:bCs/>
+          <w:lang w:eastAsia="en-IN"/>
+        </w:rPr>
+        <w:t xml:space="preserve">“QUICK FACTS </w:t>
+      </w:r>
+      <w:r>
+        <w:rPr>
+          <w:rFonts w:eastAsia="Times New Roman" w:cstheme="minorHAnsi"/>
+          <w:b/>
+          <w:bCs/>
+          <w:lang w:eastAsia="en-IN"/>
+        </w:rPr>
+        <w:t>— SELECT 4 OF X | Word limit: 25–30</w:t>
+      </w:r>
+      <w:r>
+        <w:rPr>
+          <w:rFonts w:eastAsia="Times New Roman" w:cstheme="minorHAnsi"/>
+          <w:b/>
+          <w:bCs/>
+          <w:lang w:eastAsia="en-IN"/>
+        </w:rPr>
+        <w:t xml:space="preserve"> words.”</w:t>
+      </w:r>
+      <w:r>
+        <w:rPr>
+          <w:rFonts w:eastAsia="Times New Roman" w:cstheme="minorHAnsi"/>
           <w:lang w:eastAsia="en-IN"/>
         </w:rPr>
         <w:t xml:space="preserve"> After each complete fact, show </w:t>
       </w:r>
       <w:r>
         <w:rPr>
-          <w:rFonts w:ascii="Times New Roman" w:eastAsia="Times New Roman" w:hAnsi="Times New Roman" w:cs="Times New Roman"/>
-          <w:b/>
-          <w:bCs/>
-          <w:sz w:val="24"/>
-          <w:szCs w:val="24"/>
+          <w:rFonts w:eastAsia="Times New Roman" w:cstheme="minorHAnsi"/>
+          <w:b/>
+          <w:bCs/>
           <w:lang w:eastAsia="en-IN"/>
         </w:rPr>
         <w:t>[exact word count | Editorial]</w:t>
       </w:r>
       <w:r>
         <w:rPr>
-          <w:rFonts w:ascii="Times New Roman" w:eastAsia="Times New Roman" w:hAnsi="Times New Roman" w:cs="Times New Roman"/>
-          <w:sz w:val="24"/>
-          <w:szCs w:val="24"/>
+          <w:rFonts w:eastAsia="Times New Roman" w:cstheme="minorHAnsi"/>
           <w:lang w:eastAsia="en-IN"/>
         </w:rPr>
         <w:t xml:space="preserve">, </w:t>
       </w:r>
       <w:r>
         <w:rPr>
-          <w:rFonts w:ascii="Times New Roman" w:eastAsia="Times New Roman" w:hAnsi="Times New Roman" w:cs="Times New Roman"/>
-          <w:b/>
-          <w:bCs/>
-          <w:sz w:val="24"/>
-          <w:szCs w:val="24"/>
+          <w:rFonts w:eastAsia="Times New Roman" w:cstheme="minorHAnsi"/>
+          <w:b/>
+          <w:bCs/>
           <w:lang w:eastAsia="en-IN"/>
         </w:rPr>
         <w:t>[exact word count | Current Affairs — Month Year]</w:t>
       </w:r>
       <w:r>
         <w:rPr>
-          <w:rFonts w:ascii="Times New Roman" w:eastAsia="Times New Roman" w:hAnsi="Times New Roman" w:cs="Times New Roman"/>
-          <w:sz w:val="24"/>
-          <w:szCs w:val="24"/>
-          <w:lang w:eastAsia="en-IN"/>
-        </w:rPr>
-        <w:t xml:space="preserve">, or the appropriate source/type. Metadata must appear </w:t>
-      </w:r>
-      <w:r>
-        <w:rPr>
-          <w:rFonts w:ascii="Times New Roman" w:eastAsia="Times New Roman" w:hAnsi="Times New Roman" w:cs="Times New Roman"/>
-          <w:sz w:val="24"/>
-          <w:szCs w:val="24"/>
-          <w:lang w:eastAsia="en-IN"/>
+          <w:rFonts w:eastAsia="Times New Roman" w:cstheme="minorHAnsi"/>
+          <w:lang w:eastAsia="en-IN"/>
+        </w:rPr>
+        <w:t>, or the appropriate source/type. Metadata must appear after the completed sentence, remain visible during selection, and be removed completely from the final output. Wait for the user's selection and store only the clean selected facts.</w:t>
+      </w:r>
+    </w:p>
+    <w:p>
+      <w:pPr>
+        <w:spacing w:before="100" w:beforeAutospacing="1" w:after="100" w:afterAutospacing="1" w:line="240" w:lineRule="auto"/>
+        <w:rPr>
+          <w:rFonts w:eastAsia="Times New Roman" w:cstheme="minorHAnsi"/>
+          <w:lang w:eastAsia="en-IN"/>
+        </w:rPr>
+      </w:pPr>
+      <w:r>
+        <w:rPr>
+          <w:rFonts w:eastAsia="Times New Roman" w:cstheme="minorHAnsi"/>
+          <w:b/>
+          <w:bCs/>
+          <w:lang w:eastAsia="en-IN"/>
+        </w:rPr>
+        <w:t>STAGE 4 — KEY TAKEAWAY:</w:t>
+      </w:r>
+      <w:r>
+        <w:rPr>
+          <w:rFonts w:eastAsia="Times New Roman" w:cstheme="minorHAnsi"/>
+          <w:lang w:eastAsia="en-IN"/>
+        </w:rPr>
+        <w:t xml:space="preserve"> Generate </w:t>
+      </w:r>
+      <w:r>
+        <w:rPr>
+          <w:rFonts w:eastAsia="Times New Roman" w:cstheme="minorHAnsi"/>
+          <w:b/>
+          <w:bCs/>
+          <w:lang w:eastAsia="en-IN"/>
+        </w:rPr>
+        <w:t>2 distinct Key Takeaway options</w:t>
+      </w:r>
+      <w:r>
+        <w:rPr>
+          <w:rFonts w:eastAsia="Times New Roman" w:cstheme="minorHAnsi"/>
+          <w:lang w:eastAsia="en-IN"/>
+        </w:rPr>
+        <w:t xml:space="preserve"> capturing the most important permanent educational lesson of the selected topic. Show: </w:t>
+      </w:r>
+      <w:r>
+        <w:rPr>
+          <w:rFonts w:eastAsia="Times New Roman" w:cstheme="minorHAnsi"/>
+          <w:b/>
+          <w:bCs/>
+          <w:lang w:eastAsia="en-IN"/>
+        </w:rPr>
+        <w:t>“KEY TAKEAWAY — SELECT 1 OF 2 | Word limit: 18–25 words.”</w:t>
+      </w:r>
+      <w:r>
+        <w:rPr>
+          <w:rFonts w:eastAsia="Times New Roman" w:cstheme="minorHAnsi"/>
+          <w:lang w:eastAsia="en-IN"/>
+        </w:rPr>
+        <w:t xml:space="preserve"> After each completed sentence, show its exact word count in brackets. Wait for selection and store the clean selected takeaway.</w:t>
+      </w:r>
+    </w:p>
+    <w:p>
+      <w:pPr>
+        <w:spacing w:before="100" w:beforeAutospacing="1" w:after="100" w:afterAutospacing="1" w:line="240" w:lineRule="auto"/>
+        <w:rPr>
+          <w:rFonts w:cstheme="minorHAnsi"/>
+        </w:rPr>
+      </w:pPr>
+      <w:r>
+        <w:rPr>
+          <w:rStyle w:val="Strong"/>
+          <w:rFonts w:cstheme="minorHAnsi"/>
+        </w:rPr>
+        <w:t>STAGE 5 — MAINS QUESTION:</w:t>
+      </w:r>
+      <w:r>
+        <w:rPr>
+          <w:rFonts w:cstheme="minorHAnsi"/>
+        </w:rPr>
+        <w:t xml:space="preserve"> Generate </w:t>
+      </w:r>
+      <w:r>
+        <w:rPr>
+          <w:rStyle w:val="Strong"/>
+          <w:rFonts w:cstheme="minorHAnsi"/>
+        </w:rPr>
+        <w:t>2 distinct, high-quality UPSC General Studies Mains questions</w:t>
+      </w:r>
+      <w:r>
+        <w:rPr>
+          <w:rFonts w:cstheme="minorHAnsi"/>
+        </w:rPr>
+        <w:t xml:space="preserve"> based on the complete selected material. Show both options and wait for the user to select one. Then generate the answer </w:t>
+      </w:r>
+      <w:r>
+        <w:rPr>
+          <w:rStyle w:val="Strong"/>
+          <w:rFonts w:cstheme="minorHAnsi"/>
+        </w:rPr>
+        <w:t>only for the selected question</w:t>
+      </w:r>
+      <w:r>
+        <w:rPr>
+          <w:rFonts w:cstheme="minorHAnsi"/>
+        </w:rPr>
+        <w:t xml:space="preserve">. The answer must follow a </w:t>
+      </w:r>
+      <w:r>
+        <w:rPr>
+          <w:rFonts w:cstheme="minorHAnsi"/>
         </w:rPr>
         <w:lastRenderedPageBreak/>
-        <w:t>after the completed sentence, remain visible during selection, and be removed completely from the final output. Wait for the user's selection and store only the clean selected facts.</w:t>
-      </w:r>
-    </w:p>
-    <w:p>
-      <w:pPr>
-        <w:spacing w:before="100" w:beforeAutospacing="1" w:after="100" w:afterAutospacing="1" w:line="240" w:lineRule="auto"/>
-        <w:rPr>
-          <w:rFonts w:ascii="Times New Roman" w:eastAsia="Times New Roman" w:hAnsi="Times New Roman" w:cs="Times New Roman"/>
-          <w:sz w:val="24"/>
-          <w:szCs w:val="24"/>
-          <w:lang w:eastAsia="en-IN"/>
-        </w:rPr>
-      </w:pPr>
-      <w:r>
-        <w:rPr>
-          <w:rFonts w:ascii="Times New Roman" w:eastAsia="Times New Roman" w:hAnsi="Times New Roman" w:cs="Times New Roman"/>
-          <w:b/>
-          <w:bCs/>
-          <w:sz w:val="24"/>
-          <w:szCs w:val="24"/>
-          <w:lang w:eastAsia="en-IN"/>
-        </w:rPr>
-        <w:t>STAGE 4 — KEY TAKEAWAY:</w:t>
-      </w:r>
-      <w:r>
-        <w:rPr>
-          <w:rFonts w:ascii="Times New Roman" w:eastAsia="Times New Roman" w:hAnsi="Times New Roman" w:cs="Times New Roman"/>
-          <w:sz w:val="24"/>
-          <w:szCs w:val="24"/>
-          <w:lang w:eastAsia="en-IN"/>
-        </w:rPr>
-        <w:t xml:space="preserve"> Generate </w:t>
-      </w:r>
-      <w:r>
-        <w:rPr>
-          <w:rFonts w:ascii="Times New Roman" w:eastAsia="Times New Roman" w:hAnsi="Times New Roman" w:cs="Times New Roman"/>
-          <w:b/>
-          <w:bCs/>
-          <w:sz w:val="24"/>
-          <w:szCs w:val="24"/>
-          <w:lang w:eastAsia="en-IN"/>
-        </w:rPr>
-        <w:t>2 distinct Key Takeaway options</w:t>
-      </w:r>
-      <w:r>
-        <w:rPr>
-          <w:rFonts w:ascii="Times New Roman" w:eastAsia="Times New Roman" w:hAnsi="Times New Roman" w:cs="Times New Roman"/>
-          <w:sz w:val="24"/>
-          <w:szCs w:val="24"/>
-          <w:lang w:eastAsia="en-IN"/>
-        </w:rPr>
-        <w:t xml:space="preserve"> capturing the most important permanent educational lesson of the selected topic. Show: </w:t>
-      </w:r>
-      <w:r>
-        <w:rPr>
-          <w:rFonts w:ascii="Times New Roman" w:eastAsia="Times New Roman" w:hAnsi="Times New Roman" w:cs="Times New Roman"/>
-          <w:b/>
-          <w:bCs/>
-          <w:sz w:val="24"/>
-          <w:szCs w:val="24"/>
-          <w:lang w:eastAsia="en-IN"/>
-        </w:rPr>
-        <w:t>“KEY TAKEAWAY — SELECT 1 OF 2 | Word limit: 18–25 words.”</w:t>
-      </w:r>
-      <w:r>
-        <w:rPr>
-          <w:rFonts w:ascii="Times New Roman" w:eastAsia="Times New Roman" w:hAnsi="Times New Roman" w:cs="Times New Roman"/>
-          <w:sz w:val="24"/>
-          <w:szCs w:val="24"/>
-          <w:lang w:eastAsia="en-IN"/>
-        </w:rPr>
-        <w:t xml:space="preserve"> After each completed sentence, show its exact word count in brackets. Wait for selection and store the clean selected takeaway.</w:t>
-      </w:r>
-    </w:p>
-    <w:p>
-      <w:pPr>
-        <w:spacing w:before="100" w:beforeAutospacing="1" w:after="100" w:afterAutospacing="1" w:line="240" w:lineRule="auto"/>
-        <w:rPr>
-          <w:rFonts w:ascii="Times New Roman" w:eastAsia="Times New Roman" w:hAnsi="Times New Roman" w:cs="Times New Roman"/>
-          <w:sz w:val="24"/>
-          <w:szCs w:val="24"/>
-          <w:lang w:eastAsia="en-IN"/>
-        </w:rPr>
-      </w:pPr>
-      <w:r>
-        <w:rPr>
-          <w:rFonts w:ascii="Times New Roman" w:eastAsia="Times New Roman" w:hAnsi="Times New Roman" w:cs="Times New Roman"/>
-          <w:b/>
-          <w:bCs/>
-          <w:sz w:val="24"/>
-          <w:szCs w:val="24"/>
-          <w:lang w:eastAsia="en-IN"/>
-        </w:rPr>
-        <w:t>STAGE 5 — MAINS QUESTION:</w:t>
-      </w:r>
-      <w:r>
-        <w:rPr>
-          <w:rFonts w:ascii="Times New Roman" w:eastAsia="Times New Roman" w:hAnsi="Times New Roman" w:cs="Times New Roman"/>
-          <w:sz w:val="24"/>
-          <w:szCs w:val="24"/>
-          <w:lang w:eastAsia="en-IN"/>
-        </w:rPr>
-        <w:t xml:space="preserve"> Generate </w:t>
-      </w:r>
-      <w:r>
-        <w:rPr>
-          <w:rFonts w:ascii="Times New Roman" w:eastAsia="Times New Roman" w:hAnsi="Times New Roman" w:cs="Times New Roman"/>
-          <w:b/>
-          <w:bCs/>
-          <w:sz w:val="24"/>
-          <w:szCs w:val="24"/>
-          <w:lang w:eastAsia="en-IN"/>
-        </w:rPr>
-        <w:t>2 distinct, high-quality UPSC General Studies Mains questions</w:t>
-      </w:r>
-      <w:r>
-        <w:rPr>
-          <w:rFonts w:ascii="Times New Roman" w:eastAsia="Times New Roman" w:hAnsi="Times New Roman" w:cs="Times New Roman"/>
-          <w:sz w:val="24"/>
-          <w:szCs w:val="24"/>
-          <w:lang w:eastAsia="en-IN"/>
-        </w:rPr>
-        <w:t xml:space="preserve"> based on the complete selected material. Show both options and wait for the user to select one. Then generate the answer </w:t>
-      </w:r>
-      <w:r>
-        <w:rPr>
-          <w:rFonts w:ascii="Times New Roman" w:eastAsia="Times New Roman" w:hAnsi="Times New Roman" w:cs="Times New Roman"/>
-          <w:b/>
-          <w:bCs/>
-          <w:sz w:val="24"/>
-          <w:szCs w:val="24"/>
-          <w:lang w:eastAsia="en-IN"/>
-        </w:rPr>
-        <w:t>only for the selected question</w:t>
-      </w:r>
-      <w:r>
-        <w:rPr>
-          <w:rFonts w:ascii="Times New Roman" w:eastAsia="Times New Roman" w:hAnsi="Times New Roman" w:cs="Times New Roman"/>
-          <w:sz w:val="24"/>
-          <w:szCs w:val="24"/>
-          <w:lang w:eastAsia="en-IN"/>
-        </w:rPr>
-        <w:t xml:space="preserve">. The answer must follow the established UPSC format: </w:t>
-      </w:r>
-      <w:r>
-        <w:rPr>
-          <w:rFonts w:ascii="Times New Roman" w:eastAsia="Times New Roman" w:hAnsi="Times New Roman" w:cs="Times New Roman"/>
-          <w:sz w:val="24"/>
-          <w:szCs w:val="24"/>
-          <w:lang w:eastAsia="en-IN"/>
-        </w:rPr>
-        <w:t xml:space="preserve">3paragraphs only : </w:t>
-      </w:r>
-      <w:r>
-        <w:rPr>
-          <w:rFonts w:ascii="Times New Roman" w:eastAsia="Times New Roman" w:hAnsi="Times New Roman" w:cs="Times New Roman"/>
-          <w:sz w:val="24"/>
-          <w:szCs w:val="24"/>
-          <w:lang w:eastAsia="en-IN"/>
-        </w:rPr>
-        <w:t xml:space="preserve">Introduction </w:t>
-      </w:r>
-      <w:r>
-        <w:rPr>
-          <w:rFonts w:ascii="Times New Roman" w:eastAsia="Times New Roman" w:hAnsi="Times New Roman" w:cs="Times New Roman"/>
-          <w:b/>
-          <w:bCs/>
-          <w:sz w:val="24"/>
-          <w:szCs w:val="24"/>
-          <w:lang w:eastAsia="en-IN"/>
-        </w:rPr>
-        <w:t>35–45 words</w:t>
-      </w:r>
-      <w:r>
-        <w:rPr>
-          <w:rFonts w:ascii="Times New Roman" w:eastAsia="Times New Roman" w:hAnsi="Times New Roman" w:cs="Times New Roman"/>
-          <w:sz w:val="24"/>
-          <w:szCs w:val="24"/>
-          <w:lang w:eastAsia="en-IN"/>
-        </w:rPr>
-        <w:t xml:space="preserve">, Body </w:t>
-      </w:r>
-      <w:r>
-        <w:rPr>
-          <w:rFonts w:ascii="Times New Roman" w:eastAsia="Times New Roman" w:hAnsi="Times New Roman" w:cs="Times New Roman"/>
-          <w:b/>
-          <w:bCs/>
-          <w:sz w:val="24"/>
-          <w:szCs w:val="24"/>
-          <w:lang w:eastAsia="en-IN"/>
-        </w:rPr>
-        <w:t>120–145 words</w:t>
-      </w:r>
-      <w:r>
-        <w:rPr>
-          <w:rFonts w:ascii="Times New Roman" w:eastAsia="Times New Roman" w:hAnsi="Times New Roman" w:cs="Times New Roman"/>
-          <w:sz w:val="24"/>
-          <w:szCs w:val="24"/>
-          <w:lang w:eastAsia="en-IN"/>
-        </w:rPr>
-        <w:t xml:space="preserve">, Conclusion </w:t>
-      </w:r>
-      <w:r>
-        <w:rPr>
-          <w:rFonts w:ascii="Times New Roman" w:eastAsia="Times New Roman" w:hAnsi="Times New Roman" w:cs="Times New Roman"/>
-          <w:b/>
-          <w:bCs/>
-          <w:sz w:val="24"/>
-          <w:szCs w:val="24"/>
-          <w:lang w:eastAsia="en-IN"/>
-        </w:rPr>
-        <w:t>30–40 words</w:t>
-      </w:r>
-      <w:r>
-        <w:rPr>
-          <w:rFonts w:ascii="Times New Roman" w:eastAsia="Times New Roman" w:hAnsi="Times New Roman" w:cs="Times New Roman"/>
-          <w:sz w:val="24"/>
-          <w:szCs w:val="24"/>
-          <w:lang w:eastAsia="en-IN"/>
-        </w:rPr>
-        <w:t xml:space="preserve">, with a total of </w:t>
-      </w:r>
-      <w:r>
-        <w:rPr>
-          <w:rFonts w:ascii="Times New Roman" w:eastAsia="Times New Roman" w:hAnsi="Times New Roman" w:cs="Times New Roman"/>
-          <w:b/>
-          <w:bCs/>
-          <w:sz w:val="24"/>
-          <w:szCs w:val="24"/>
-          <w:lang w:eastAsia="en-IN"/>
-        </w:rPr>
-        <w:t>190–225 words and never more than 230 words</w:t>
-      </w:r>
-      <w:r>
-        <w:rPr>
-          <w:rFonts w:ascii="Times New Roman" w:eastAsia="Times New Roman" w:hAnsi="Times New Roman" w:cs="Times New Roman"/>
-          <w:sz w:val="24"/>
-          <w:szCs w:val="24"/>
-          <w:lang w:eastAsia="en-IN"/>
-        </w:rPr>
-        <w:t>. Show the word count of each paragraph and the total after the completed answer for selection/verification only. The metadata must not appear in the final output. The answer must be original, balanced, analytical, factually accurate and tightly focused on the selected question.</w:t>
-      </w:r>
-    </w:p>
-    <w:p>
-      <w:pPr>
-        <w:spacing w:before="100" w:beforeAutospacing="1" w:after="100" w:afterAutospacing="1" w:line="240" w:lineRule="auto"/>
-        <w:rPr>
-          <w:rFonts w:ascii="Times New Roman" w:eastAsia="Times New Roman" w:hAnsi="Times New Roman" w:cs="Times New Roman"/>
-          <w:sz w:val="24"/>
-          <w:szCs w:val="24"/>
-          <w:lang w:eastAsia="en-IN"/>
-        </w:rPr>
-      </w:pPr>
-      <w:r>
-        <w:rPr>
-          <w:rFonts w:ascii="Times New Roman" w:eastAsia="Times New Roman" w:hAnsi="Times New Roman" w:cs="Times New Roman"/>
-          <w:b/>
-          <w:bCs/>
-          <w:sz w:val="24"/>
-          <w:szCs w:val="24"/>
+        <w:t xml:space="preserve">clear UPSC structure consisting of </w:t>
+      </w:r>
+      <w:r>
+        <w:rPr>
+          <w:rStyle w:val="Strong"/>
+          <w:rFonts w:cstheme="minorHAnsi"/>
+        </w:rPr>
+        <w:t>Introduction, Main Body and Conclusion</w:t>
+      </w:r>
+      <w:r>
+        <w:rPr>
+          <w:rFonts w:cstheme="minorHAnsi"/>
+        </w:rPr>
+        <w:t xml:space="preserve">, with a strict total length of </w:t>
+      </w:r>
+      <w:r>
+        <w:rPr>
+          <w:rStyle w:val="Strong"/>
+          <w:rFonts w:cstheme="minorHAnsi"/>
+        </w:rPr>
+        <w:t>200–210 words and never more than 210 words</w:t>
+      </w:r>
+      <w:r>
+        <w:rPr>
+          <w:rFonts w:cstheme="minorHAnsi"/>
+        </w:rPr>
+        <w:t xml:space="preserve">. The </w:t>
+      </w:r>
+      <w:r>
+        <w:rPr>
+          <w:rStyle w:val="Strong"/>
+          <w:rFonts w:cstheme="minorHAnsi"/>
+        </w:rPr>
+        <w:t>Introduction must be 30–35 words</w:t>
+      </w:r>
+      <w:r>
+        <w:rPr>
+          <w:rFonts w:cstheme="minorHAnsi"/>
+        </w:rPr>
+        <w:t xml:space="preserve">, briefly establishing the context, issue and central argument. The </w:t>
+      </w:r>
+      <w:r>
+        <w:rPr>
+          <w:rStyle w:val="Strong"/>
+          <w:rFonts w:cstheme="minorHAnsi"/>
+        </w:rPr>
+        <w:t>Main Body must be 135–145 words</w:t>
+      </w:r>
+      <w:r>
+        <w:rPr>
+          <w:rFonts w:cstheme="minorHAnsi"/>
+        </w:rPr>
+        <w:t xml:space="preserve"> and provide the core analysis; it may be written as a coherent paragraph or presented point-wise when distinct dimensions, arguments, challenges, impacts, measures or recommendations are better expressed separately. When using points, keep them concise, analytical and logically connected, avoid unnecessary subheadings and repetition, and do not reduce the answer to a mere fact list. The </w:t>
+      </w:r>
+      <w:r>
+        <w:rPr>
+          <w:rStyle w:val="Strong"/>
+          <w:rFonts w:cstheme="minorHAnsi"/>
+        </w:rPr>
+        <w:t>Conclusion must be 30–35 words</w:t>
+      </w:r>
+      <w:r>
+        <w:rPr>
+          <w:rFonts w:cstheme="minorHAnsi"/>
+        </w:rPr>
+        <w:t>, balanced, forward-looking and directly responsive to the question. Show the word count of the Introduction, Main Body, Conclusion and the total after the completed answer for selection/verification only. The metadata must not appear in the final output. The answer must be original, balanced, analytical, factually accurate, well-structured and tightly focused on the selected question.</w:t>
+      </w:r>
+    </w:p>
+    <w:p>
+      <w:pPr>
+        <w:spacing w:before="100" w:beforeAutospacing="1" w:after="100" w:afterAutospacing="1" w:line="240" w:lineRule="auto"/>
+        <w:rPr>
+          <w:rFonts w:eastAsia="Times New Roman" w:cstheme="minorHAnsi"/>
+          <w:lang w:eastAsia="en-IN"/>
+        </w:rPr>
+      </w:pPr>
+      <w:r>
+        <w:rPr>
+          <w:rFonts w:eastAsia="Times New Roman" w:cstheme="minorHAnsi"/>
+          <w:b/>
+          <w:bCs/>
           <w:lang w:eastAsia="en-IN"/>
         </w:rPr>
         <w:t>STAGE 6 — MCQs:</w:t>
       </w:r>
       <w:r>
         <w:rPr>
-          <w:rFonts w:ascii="Times New Roman" w:eastAsia="Times New Roman" w:hAnsi="Times New Roman" w:cs="Times New Roman"/>
-          <w:sz w:val="24"/>
-          <w:szCs w:val="24"/>
+          <w:rFonts w:eastAsia="Times New Roman" w:cstheme="minorHAnsi"/>
           <w:lang w:eastAsia="en-IN"/>
         </w:rPr>
         <w:t xml:space="preserve"> Based on the complete selected educational material, generate </w:t>
       </w:r>
       <w:r>
         <w:rPr>
-          <w:rFonts w:ascii="Times New Roman" w:eastAsia="Times New Roman" w:hAnsi="Times New Roman" w:cs="Times New Roman"/>
-          <w:b/>
-          <w:bCs/>
-          <w:sz w:val="24"/>
-          <w:szCs w:val="24"/>
-          <w:lang w:eastAsia="en-IN"/>
-        </w:rPr>
-        <w:t>5 distinct UPSC Prelims-style MCQs</w:t>
-      </w:r>
-      <w:r>
-        <w:rPr>
-          <w:rFonts w:ascii="Times New Roman" w:eastAsia="Times New Roman" w:hAnsi="Times New Roman" w:cs="Times New Roman"/>
-          <w:sz w:val="24"/>
-          <w:szCs w:val="24"/>
+          <w:rFonts w:eastAsia="Times New Roman" w:cstheme="minorHAnsi"/>
+          <w:b/>
+          <w:bCs/>
+          <w:lang w:eastAsia="en-IN"/>
+        </w:rPr>
+        <w:t>4</w:t>
+      </w:r>
+      <w:r>
+        <w:rPr>
+          <w:rFonts w:eastAsia="Times New Roman" w:cstheme="minorHAnsi"/>
+          <w:b/>
+          <w:bCs/>
+          <w:lang w:eastAsia="en-IN"/>
+        </w:rPr>
+        <w:t xml:space="preserve"> distinct UPSC Prelims-style MCQs</w:t>
+      </w:r>
+      <w:r>
+        <w:rPr>
+          <w:rFonts w:eastAsia="Times New Roman" w:cstheme="minorHAnsi"/>
           <w:lang w:eastAsia="en-IN"/>
         </w:rPr>
         <w:t xml:space="preserve"> and allow the user to select </w:t>
       </w:r>
       <w:r>
         <w:rPr>
-          <w:rFonts w:ascii="Times New Roman" w:eastAsia="Times New Roman" w:hAnsi="Times New Roman" w:cs="Times New Roman"/>
-          <w:b/>
-          <w:bCs/>
-          <w:sz w:val="24"/>
-          <w:szCs w:val="24"/>
+          <w:rFonts w:eastAsia="Times New Roman" w:cstheme="minorHAnsi"/>
+          <w:b/>
+          <w:bCs/>
           <w:lang w:eastAsia="en-IN"/>
         </w:rPr>
         <w:t>3</w:t>
       </w:r>
       <w:r>
         <w:rPr>
-          <w:rFonts w:ascii="Times New Roman" w:eastAsia="Times New Roman" w:hAnsi="Times New Roman" w:cs="Times New Roman"/>
-          <w:sz w:val="24"/>
-          <w:szCs w:val="24"/>
+          <w:rFonts w:eastAsia="Times New Roman" w:cstheme="minorHAnsi"/>
           <w:lang w:eastAsia="en-IN"/>
         </w:rPr>
         <w:t>. Each must have one unambiguous correct answer, four options (A–D), and a concise conceptual explanation. Use varied formats such as statement-based, conceptual, matching or application-based questions where appropriate. Do not repeat the same concept merely to increase the number. Show any useful word count/source metadata after the completed MCQ for selection only, and remove all such metadata from the final output.</w:t>
@@ -944,128 +754,102 @@
       <w:pPr>
         <w:spacing w:before="100" w:beforeAutospacing="1" w:after="100" w:afterAutospacing="1" w:line="240" w:lineRule="auto"/>
         <w:rPr>
-          <w:rFonts w:ascii="Times New Roman" w:eastAsia="Times New Roman" w:hAnsi="Times New Roman" w:cs="Times New Roman"/>
-          <w:sz w:val="24"/>
-          <w:szCs w:val="24"/>
-          <w:lang w:eastAsia="en-IN"/>
-        </w:rPr>
-      </w:pPr>
-      <w:r>
-        <w:rPr>
-          <w:rFonts w:ascii="Times New Roman" w:eastAsia="Times New Roman" w:hAnsi="Times New Roman" w:cs="Times New Roman"/>
-          <w:b/>
-          <w:bCs/>
-          <w:sz w:val="24"/>
-          <w:szCs w:val="24"/>
+          <w:rFonts w:eastAsia="Times New Roman" w:cstheme="minorHAnsi"/>
+          <w:lang w:eastAsia="en-IN"/>
+        </w:rPr>
+      </w:pPr>
+      <w:r>
+        <w:rPr>
+          <w:rFonts w:eastAsia="Times New Roman" w:cstheme="minorHAnsi"/>
+          <w:b/>
+          <w:bCs/>
           <w:lang w:eastAsia="en-IN"/>
         </w:rPr>
         <w:t>STAGE 7 — RECALL ANCHORS:</w:t>
       </w:r>
       <w:r>
         <w:rPr>
-          <w:rFonts w:ascii="Times New Roman" w:eastAsia="Times New Roman" w:hAnsi="Times New Roman" w:cs="Times New Roman"/>
-          <w:sz w:val="24"/>
-          <w:szCs w:val="24"/>
+          <w:rFonts w:eastAsia="Times New Roman" w:cstheme="minorHAnsi"/>
           <w:lang w:eastAsia="en-IN"/>
         </w:rPr>
         <w:t xml:space="preserve"> Only after all previous selections are complete, analyse </w:t>
       </w:r>
       <w:r>
         <w:rPr>
-          <w:rFonts w:ascii="Times New Roman" w:eastAsia="Times New Roman" w:hAnsi="Times New Roman" w:cs="Times New Roman"/>
-          <w:b/>
-          <w:bCs/>
-          <w:sz w:val="24"/>
-          <w:szCs w:val="24"/>
+          <w:rFonts w:eastAsia="Times New Roman" w:cstheme="minorHAnsi"/>
+          <w:b/>
+          <w:bCs/>
           <w:lang w:eastAsia="en-IN"/>
         </w:rPr>
         <w:t>ALL selected material together</w:t>
       </w:r>
       <w:r>
         <w:rPr>
-          <w:rFonts w:ascii="Times New Roman" w:eastAsia="Times New Roman" w:hAnsi="Times New Roman" w:cs="Times New Roman"/>
-          <w:sz w:val="24"/>
-          <w:szCs w:val="24"/>
+          <w:rFonts w:eastAsia="Times New Roman" w:cstheme="minorHAnsi"/>
           <w:lang w:eastAsia="en-IN"/>
         </w:rPr>
         <w:t xml:space="preserve"> — selected Question, 5 Knowledge Points, 4 Quick Facts, Key Takeaway, selected Mains Question and Answer, and 3 selected MCQs. Generate </w:t>
       </w:r>
       <w:r>
         <w:rPr>
-          <w:rFonts w:ascii="Times New Roman" w:eastAsia="Times New Roman" w:hAnsi="Times New Roman" w:cs="Times New Roman"/>
-          <w:b/>
-          <w:bCs/>
-          <w:sz w:val="24"/>
-          <w:szCs w:val="24"/>
+          <w:rFonts w:eastAsia="Times New Roman" w:cstheme="minorHAnsi"/>
+          <w:b/>
+          <w:bCs/>
           <w:lang w:eastAsia="en-IN"/>
         </w:rPr>
         <w:t>8 strong Recall Anchor options</w:t>
       </w:r>
       <w:r>
         <w:rPr>
-          <w:rFonts w:ascii="Times New Roman" w:eastAsia="Times New Roman" w:hAnsi="Times New Roman" w:cs="Times New Roman"/>
-          <w:sz w:val="24"/>
-          <w:szCs w:val="24"/>
+          <w:rFonts w:eastAsia="Times New Roman" w:cstheme="minorHAnsi"/>
           <w:lang w:eastAsia="en-IN"/>
         </w:rPr>
         <w:t xml:space="preserve">, or fewer if fewer genuinely meaningful anchors exist, and ask the user to select </w:t>
       </w:r>
       <w:r>
         <w:rPr>
-          <w:rFonts w:ascii="Times New Roman" w:eastAsia="Times New Roman" w:hAnsi="Times New Roman" w:cs="Times New Roman"/>
-          <w:b/>
-          <w:bCs/>
-          <w:sz w:val="24"/>
-          <w:szCs w:val="24"/>
+          <w:rFonts w:eastAsia="Times New Roman" w:cstheme="minorHAnsi"/>
+          <w:b/>
+          <w:bCs/>
           <w:lang w:eastAsia="en-IN"/>
         </w:rPr>
         <w:t>5</w:t>
       </w:r>
       <w:r>
         <w:rPr>
-          <w:rFonts w:ascii="Times New Roman" w:eastAsia="Times New Roman" w:hAnsi="Times New Roman" w:cs="Times New Roman"/>
-          <w:sz w:val="24"/>
-          <w:szCs w:val="24"/>
+          <w:rFonts w:eastAsia="Times New Roman" w:cstheme="minorHAnsi"/>
           <w:lang w:eastAsia="en-IN"/>
         </w:rPr>
         <w:t xml:space="preserve">. Anchors must be </w:t>
       </w:r>
       <w:r>
         <w:rPr>
-          <w:rFonts w:ascii="Times New Roman" w:eastAsia="Times New Roman" w:hAnsi="Times New Roman" w:cs="Times New Roman"/>
-          <w:b/>
-          <w:bCs/>
-          <w:sz w:val="24"/>
-          <w:szCs w:val="24"/>
+          <w:rFonts w:eastAsia="Times New Roman" w:cstheme="minorHAnsi"/>
+          <w:b/>
+          <w:bCs/>
           <w:lang w:eastAsia="en-IN"/>
         </w:rPr>
         <w:t>1–3 words each</w:t>
       </w:r>
       <w:r>
         <w:rPr>
-          <w:rFonts w:ascii="Times New Roman" w:eastAsia="Times New Roman" w:hAnsi="Times New Roman" w:cs="Times New Roman"/>
-          <w:sz w:val="24"/>
-          <w:szCs w:val="24"/>
+          <w:rFonts w:eastAsia="Times New Roman" w:cstheme="minorHAnsi"/>
           <w:lang w:eastAsia="en-IN"/>
         </w:rPr>
         <w:t xml:space="preserve">, specific, memorable and information-rich. They must collectively act as a memory map of the </w:t>
       </w:r>
       <w:r>
         <w:rPr>
-          <w:rFonts w:ascii="Times New Roman" w:eastAsia="Times New Roman" w:hAnsi="Times New Roman" w:cs="Times New Roman"/>
-          <w:b/>
-          <w:bCs/>
-          <w:sz w:val="24"/>
-          <w:szCs w:val="24"/>
+          <w:rFonts w:eastAsia="Times New Roman" w:cstheme="minorHAnsi"/>
+          <w:b/>
+          <w:bCs/>
           <w:lang w:eastAsia="en-IN"/>
         </w:rPr>
         <w:t>entire final educational module</w:t>
       </w:r>
       <w:r>
         <w:rPr>
-          <w:rFonts w:ascii="Times New Roman" w:eastAsia="Times New Roman" w:hAnsi="Times New Roman" w:cs="Times New Roman"/>
-          <w:sz w:val="24"/>
-          <w:szCs w:val="24"/>
+          <w:rFonts w:eastAsia="Times New Roman" w:cstheme="minorHAnsi"/>
           <w:lang w:eastAsia="en-IN"/>
         </w:rPr>
         <w:t>, covering different sections and dimensions rather than concentrating on only one concept or section. Do not create multiple anchors from the same concept. Ensure every selected anchor is meaningfully represented somewhere in the final content. Show the relevant word count/source metadata after each anchor if useful for selection, but remove all metadata from the final output.</w:t>
@@ -1075,68 +859,54 @@
       <w:pPr>
         <w:spacing w:before="100" w:beforeAutospacing="1" w:after="100" w:afterAutospacing="1" w:line="240" w:lineRule="auto"/>
         <w:rPr>
-          <w:rFonts w:ascii="Times New Roman" w:eastAsia="Times New Roman" w:hAnsi="Times New Roman" w:cs="Times New Roman"/>
-          <w:sz w:val="24"/>
-          <w:szCs w:val="24"/>
-          <w:lang w:eastAsia="en-IN"/>
-        </w:rPr>
-      </w:pPr>
-      <w:r>
-        <w:rPr>
-          <w:rFonts w:ascii="Times New Roman" w:eastAsia="Times New Roman" w:hAnsi="Times New Roman" w:cs="Times New Roman"/>
-          <w:b/>
-          <w:bCs/>
-          <w:sz w:val="24"/>
-          <w:szCs w:val="24"/>
+          <w:rFonts w:eastAsia="Times New Roman" w:cstheme="minorHAnsi"/>
+          <w:lang w:eastAsia="en-IN"/>
+        </w:rPr>
+      </w:pPr>
+      <w:r>
+        <w:rPr>
+          <w:rFonts w:eastAsia="Times New Roman" w:cstheme="minorHAnsi"/>
+          <w:b/>
+          <w:bCs/>
           <w:lang w:eastAsia="en-IN"/>
         </w:rPr>
         <w:t>GLOBAL RULES:</w:t>
       </w:r>
       <w:r>
         <w:rPr>
-          <w:rFonts w:ascii="Times New Roman" w:eastAsia="Times New Roman" w:hAnsi="Times New Roman" w:cs="Times New Roman"/>
-          <w:sz w:val="24"/>
-          <w:szCs w:val="24"/>
+          <w:rFonts w:eastAsia="Times New Roman" w:cstheme="minorHAnsi"/>
           <w:lang w:eastAsia="en-IN"/>
         </w:rPr>
         <w:t xml:space="preserve"> Quality is more important than numerical targets. If fewer genuinely strong options exist, provide fewer rather than inventing, repeating, stretching or weakening content. Never repeat the same concept merely to increase the number of options. Keep the distinction clear: </w:t>
       </w:r>
       <w:r>
         <w:rPr>
-          <w:rFonts w:ascii="Times New Roman" w:eastAsia="Times New Roman" w:hAnsi="Times New Roman" w:cs="Times New Roman"/>
-          <w:b/>
-          <w:bCs/>
-          <w:sz w:val="24"/>
-          <w:szCs w:val="24"/>
+          <w:rFonts w:eastAsia="Times New Roman" w:cstheme="minorHAnsi"/>
+          <w:b/>
+          <w:bCs/>
           <w:lang w:eastAsia="en-IN"/>
         </w:rPr>
         <w:t>Knowledge Points = understanding and concepts; Quick Facts = factual recall.</w:t>
       </w:r>
       <w:r>
         <w:rPr>
-          <w:rFonts w:ascii="Times New Roman" w:eastAsia="Times New Roman" w:hAnsi="Times New Roman" w:cs="Times New Roman"/>
-          <w:sz w:val="24"/>
-          <w:szCs w:val="24"/>
+          <w:rFonts w:eastAsia="Times New Roman" w:cstheme="minorHAnsi"/>
           <w:lang w:eastAsia="en-IN"/>
         </w:rPr>
         <w:t xml:space="preserve"> All generated content must be original, simple, precise, student-friendly, UPSC-oriented and internally consistent. Verify factual claims using authoritative sources whenever external information is used. The editorial's facts may be used in Quick Facts but should not automatically become Knowledge Points. During every selection stage, display the applicable word limit and, after each completed option, its exact word count and source/type where relevant. These selection metadata must </w:t>
       </w:r>
       <w:r>
         <w:rPr>
-          <w:rFonts w:ascii="Times New Roman" w:eastAsia="Times New Roman" w:hAnsi="Times New Roman" w:cs="Times New Roman"/>
-          <w:b/>
-          <w:bCs/>
-          <w:sz w:val="24"/>
-          <w:szCs w:val="24"/>
+          <w:rFonts w:eastAsia="Times New Roman" w:cstheme="minorHAnsi"/>
+          <w:b/>
+          <w:bCs/>
           <w:lang w:eastAsia="en-IN"/>
         </w:rPr>
         <w:t>never</w:t>
       </w:r>
       <w:r>
         <w:rPr>
-          <w:rFonts w:ascii="Times New Roman" w:eastAsia="Times New Roman" w:hAnsi="Times New Roman" w:cs="Times New Roman"/>
-          <w:sz w:val="24"/>
-          <w:szCs w:val="24"/>
+          <w:rFonts w:eastAsia="Times New Roman" w:cstheme="minorHAnsi"/>
           <w:lang w:eastAsia="en-IN"/>
         </w:rPr>
         <w:t xml:space="preserve"> enter the final output. Preserve every user selection exactly and do not regenerate selected content unless explicitly asked.</w:t>
@@ -1146,100 +916,82 @@
       <w:pPr>
         <w:spacing w:before="100" w:beforeAutospacing="1" w:after="100" w:afterAutospacing="1" w:line="240" w:lineRule="auto"/>
         <w:rPr>
-          <w:rFonts w:ascii="Times New Roman" w:eastAsia="Times New Roman" w:hAnsi="Times New Roman" w:cs="Times New Roman"/>
-          <w:sz w:val="24"/>
-          <w:szCs w:val="24"/>
-          <w:lang w:eastAsia="en-IN"/>
-        </w:rPr>
-      </w:pPr>
-      <w:r>
-        <w:rPr>
-          <w:rFonts w:ascii="Times New Roman" w:eastAsia="Times New Roman" w:hAnsi="Times New Roman" w:cs="Times New Roman"/>
-          <w:sz w:val="24"/>
-          <w:szCs w:val="24"/>
+          <w:rFonts w:eastAsia="Times New Roman" w:cstheme="minorHAnsi"/>
+          <w:lang w:eastAsia="en-IN"/>
+        </w:rPr>
+      </w:pPr>
+      <w:r>
+        <w:rPr>
+          <w:rFonts w:eastAsia="Times New Roman" w:cstheme="minorHAnsi"/>
+          <w:lang w:eastAsia="en-IN"/>
+        </w:rPr>
+        <w:t>OUTPUT FORMAT</w:t>
+      </w:r>
+    </w:p>
+    <w:p>
+      <w:pPr>
+        <w:spacing w:before="100" w:beforeAutospacing="1" w:after="100" w:afterAutospacing="1" w:line="240" w:lineRule="auto"/>
+        <w:rPr>
+          <w:rFonts w:eastAsia="Times New Roman" w:cstheme="minorHAnsi"/>
+          <w:lang w:eastAsia="en-IN"/>
+        </w:rPr>
+      </w:pPr>
+      <w:r>
+        <w:rPr>
+          <w:rFonts w:eastAsia="Times New Roman" w:cstheme="minorHAnsi"/>
+          <w:lang w:eastAsia="en-IN"/>
+        </w:rPr>
+        <w:t>After completing all educational sections and all user selections, present every final topic using the following exact order and structure:</w:t>
+      </w:r>
+      <w:bookmarkStart w:id="0" w:name="_GoBack"/>
+      <w:bookmarkEnd w:id="0"/>
+    </w:p>
+    <w:p>
+      <w:pPr>
+        <w:spacing w:before="100" w:beforeAutospacing="1" w:after="100" w:afterAutospacing="1" w:line="240" w:lineRule="auto"/>
+        <w:rPr>
+          <w:rFonts w:eastAsia="Times New Roman" w:cstheme="minorHAnsi"/>
+          <w:lang w:eastAsia="en-IN"/>
+        </w:rPr>
+      </w:pPr>
+      <w:r>
+        <w:rPr>
+          <w:rFonts w:eastAsia="Times New Roman" w:cstheme="minorHAnsi"/>
+          <w:lang w:eastAsia="en-IN"/>
+        </w:rPr>
+        <w:t>TOPIC X</w:t>
+      </w:r>
+    </w:p>
+    <w:p>
+      <w:pPr>
+        <w:spacing w:before="100" w:beforeAutospacing="1" w:after="100" w:afterAutospacing="1" w:line="240" w:lineRule="auto"/>
+        <w:rPr>
+          <w:rFonts w:eastAsia="Times New Roman" w:cstheme="minorHAnsi"/>
+          <w:lang w:eastAsia="en-IN"/>
+        </w:rPr>
+      </w:pPr>
+      <w:r>
+        <w:rPr>
+          <w:rFonts w:eastAsia="Times New Roman" w:cstheme="minorHAnsi"/>
+          <w:lang w:eastAsia="en-IN"/>
+        </w:rPr>
+        <w:t>ISSUE TITLE</w:t>
+      </w:r>
+    </w:p>
+    <w:p>
+      <w:pPr>
+        <w:spacing w:before="100" w:beforeAutospacing="1" w:after="100" w:afterAutospacing="1" w:line="240" w:lineRule="auto"/>
+        <w:rPr>
+          <w:rFonts w:eastAsia="Times New Roman" w:cstheme="minorHAnsi"/>
+          <w:lang w:eastAsia="en-IN"/>
+        </w:rPr>
+      </w:pPr>
+      <w:r>
+        <w:rPr>
+          <w:rFonts w:eastAsia="Times New Roman" w:cstheme="minorHAnsi"/>
           <w:lang w:eastAsia="en-IN"/>
         </w:rPr>
         <w:lastRenderedPageBreak/>
-        <w:t>OUTPUT FORMAT</w:t>
-      </w:r>
-    </w:p>
-    <w:p>
-      <w:pPr>
-        <w:spacing w:before="100" w:beforeAutospacing="1" w:after="100" w:afterAutospacing="1" w:line="240" w:lineRule="auto"/>
-        <w:rPr>
-          <w:rFonts w:ascii="Times New Roman" w:eastAsia="Times New Roman" w:hAnsi="Times New Roman" w:cs="Times New Roman"/>
-          <w:sz w:val="24"/>
-          <w:szCs w:val="24"/>
-          <w:lang w:eastAsia="en-IN"/>
-        </w:rPr>
-      </w:pPr>
-      <w:r>
-        <w:rPr>
-          <w:rFonts w:ascii="Times New Roman" w:eastAsia="Times New Roman" w:hAnsi="Times New Roman" w:cs="Times New Roman"/>
-          <w:sz w:val="24"/>
-          <w:szCs w:val="24"/>
-          <w:lang w:eastAsia="en-IN"/>
-        </w:rPr>
-        <w:t>After completing all educational sections and all user selections, present every final topic using the following exact order and structure:</w:t>
-      </w:r>
-    </w:p>
-    <w:p>
-      <w:pPr>
-        <w:spacing w:before="100" w:beforeAutospacing="1" w:after="100" w:afterAutospacing="1" w:line="240" w:lineRule="auto"/>
-        <w:rPr>
-          <w:rFonts w:ascii="Times New Roman" w:eastAsia="Times New Roman" w:hAnsi="Times New Roman" w:cs="Times New Roman"/>
-          <w:sz w:val="24"/>
-          <w:szCs w:val="24"/>
-          <w:lang w:eastAsia="en-IN"/>
-        </w:rPr>
-      </w:pPr>
-      <w:r>
-        <w:rPr>
-          <w:rFonts w:ascii="Times New Roman" w:eastAsia="Times New Roman" w:hAnsi="Times New Roman" w:cs="Times New Roman"/>
-          <w:sz w:val="24"/>
-          <w:szCs w:val="24"/>
-          <w:lang w:eastAsia="en-IN"/>
-        </w:rPr>
-        <w:t>TOPIC X</w:t>
-      </w:r>
-    </w:p>
-    <w:p>
-      <w:pPr>
-        <w:spacing w:before="100" w:beforeAutospacing="1" w:after="100" w:afterAutospacing="1" w:line="240" w:lineRule="auto"/>
-        <w:rPr>
-          <w:rFonts w:ascii="Times New Roman" w:eastAsia="Times New Roman" w:hAnsi="Times New Roman" w:cs="Times New Roman"/>
-          <w:sz w:val="24"/>
-          <w:szCs w:val="24"/>
-          <w:lang w:eastAsia="en-IN"/>
-        </w:rPr>
-      </w:pPr>
-      <w:r>
-        <w:rPr>
-          <w:rFonts w:ascii="Times New Roman" w:eastAsia="Times New Roman" w:hAnsi="Times New Roman" w:cs="Times New Roman"/>
-          <w:sz w:val="24"/>
-          <w:szCs w:val="24"/>
-          <w:lang w:eastAsia="en-IN"/>
-        </w:rPr>
-        <w:t>ISSUE TITLE</w:t>
-      </w:r>
-    </w:p>
-    <w:p>
-      <w:pPr>
-        <w:spacing w:before="100" w:beforeAutospacing="1" w:after="100" w:afterAutospacing="1" w:line="240" w:lineRule="auto"/>
-        <w:rPr>
-          <w:rFonts w:ascii="Times New Roman" w:eastAsia="Times New Roman" w:hAnsi="Times New Roman" w:cs="Times New Roman"/>
-          <w:sz w:val="24"/>
-          <w:szCs w:val="24"/>
-          <w:lang w:eastAsia="en-IN"/>
-        </w:rPr>
-      </w:pPr>
-      <w:r>
-        <w:rPr>
-          <w:rFonts w:ascii="Times New Roman" w:eastAsia="Times New Roman" w:hAnsi="Times New Roman" w:cs="Times New Roman"/>
-          <w:sz w:val="24"/>
-          <w:szCs w:val="24"/>
-          <w:lang w:eastAsia="en-IN"/>
-        </w:rPr>
         <w:t>RATING</w:t>
       </w:r>
     </w:p>
@@ -1247,17 +999,13 @@
       <w:pPr>
         <w:spacing w:before="100" w:beforeAutospacing="1" w:after="100" w:afterAutospacing="1" w:line="240" w:lineRule="auto"/>
         <w:rPr>
-          <w:rFonts w:ascii="Times New Roman" w:eastAsia="Times New Roman" w:hAnsi="Times New Roman" w:cs="Times New Roman"/>
-          <w:sz w:val="24"/>
-          <w:szCs w:val="24"/>
-          <w:lang w:eastAsia="en-IN"/>
-        </w:rPr>
-      </w:pPr>
-      <w:r>
-        <w:rPr>
-          <w:rFonts w:ascii="Times New Roman" w:eastAsia="Times New Roman" w:hAnsi="Times New Roman" w:cs="Times New Roman"/>
-          <w:sz w:val="24"/>
-          <w:szCs w:val="24"/>
+          <w:rFonts w:eastAsia="Times New Roman" w:cstheme="minorHAnsi"/>
+          <w:lang w:eastAsia="en-IN"/>
+        </w:rPr>
+      </w:pPr>
+      <w:r>
+        <w:rPr>
+          <w:rFonts w:eastAsia="Times New Roman" w:cstheme="minorHAnsi"/>
           <w:lang w:eastAsia="en-IN"/>
         </w:rPr>
         <w:t>EDITORIAL SOURCE(S)</w:t>
@@ -1267,17 +1015,13 @@
       <w:pPr>
         <w:spacing w:before="100" w:beforeAutospacing="1" w:after="100" w:afterAutospacing="1" w:line="240" w:lineRule="auto"/>
         <w:rPr>
-          <w:rFonts w:ascii="Times New Roman" w:eastAsia="Times New Roman" w:hAnsi="Times New Roman" w:cs="Times New Roman"/>
-          <w:sz w:val="24"/>
-          <w:szCs w:val="24"/>
-          <w:lang w:eastAsia="en-IN"/>
-        </w:rPr>
-      </w:pPr>
-      <w:r>
-        <w:rPr>
-          <w:rFonts w:ascii="Times New Roman" w:eastAsia="Times New Roman" w:hAnsi="Times New Roman" w:cs="Times New Roman"/>
-          <w:sz w:val="24"/>
-          <w:szCs w:val="24"/>
+          <w:rFonts w:eastAsia="Times New Roman" w:cstheme="minorHAnsi"/>
+          <w:lang w:eastAsia="en-IN"/>
+        </w:rPr>
+      </w:pPr>
+      <w:r>
+        <w:rPr>
+          <w:rFonts w:eastAsia="Times New Roman" w:cstheme="minorHAnsi"/>
           <w:lang w:eastAsia="en-IN"/>
         </w:rPr>
         <w:t>GS MAPPING</w:t>
@@ -1287,17 +1031,13 @@
       <w:pPr>
         <w:spacing w:before="100" w:beforeAutospacing="1" w:after="100" w:afterAutospacing="1" w:line="240" w:lineRule="auto"/>
         <w:rPr>
-          <w:rFonts w:ascii="Times New Roman" w:eastAsia="Times New Roman" w:hAnsi="Times New Roman" w:cs="Times New Roman"/>
-          <w:sz w:val="24"/>
-          <w:szCs w:val="24"/>
-          <w:lang w:eastAsia="en-IN"/>
-        </w:rPr>
-      </w:pPr>
-      <w:r>
-        <w:rPr>
-          <w:rFonts w:ascii="Times New Roman" w:eastAsia="Times New Roman" w:hAnsi="Times New Roman" w:cs="Times New Roman"/>
-          <w:sz w:val="24"/>
-          <w:szCs w:val="24"/>
+          <w:rFonts w:eastAsia="Times New Roman" w:cstheme="minorHAnsi"/>
+          <w:lang w:eastAsia="en-IN"/>
+        </w:rPr>
+      </w:pPr>
+      <w:r>
+        <w:rPr>
+          <w:rFonts w:eastAsia="Times New Roman" w:cstheme="minorHAnsi"/>
           <w:lang w:eastAsia="en-IN"/>
         </w:rPr>
         <w:t>TODAY'S QUESTION</w:t>
@@ -1307,17 +1047,13 @@
       <w:pPr>
         <w:spacing w:before="100" w:beforeAutospacing="1" w:after="100" w:afterAutospacing="1" w:line="240" w:lineRule="auto"/>
         <w:rPr>
-          <w:rFonts w:ascii="Times New Roman" w:eastAsia="Times New Roman" w:hAnsi="Times New Roman" w:cs="Times New Roman"/>
-          <w:sz w:val="24"/>
-          <w:szCs w:val="24"/>
-          <w:lang w:eastAsia="en-IN"/>
-        </w:rPr>
-      </w:pPr>
-      <w:r>
-        <w:rPr>
-          <w:rFonts w:ascii="Times New Roman" w:eastAsia="Times New Roman" w:hAnsi="Times New Roman" w:cs="Times New Roman"/>
-          <w:sz w:val="24"/>
-          <w:szCs w:val="24"/>
+          <w:rFonts w:eastAsia="Times New Roman" w:cstheme="minorHAnsi"/>
+          <w:lang w:eastAsia="en-IN"/>
+        </w:rPr>
+      </w:pPr>
+      <w:r>
+        <w:rPr>
+          <w:rFonts w:eastAsia="Times New Roman" w:cstheme="minorHAnsi"/>
           <w:lang w:eastAsia="en-IN"/>
         </w:rPr>
         <w:t>RECALL ANCHORS</w:t>
@@ -1331,9 +1067,7 @@
         </w:numPr>
         <w:spacing w:before="100" w:beforeAutospacing="1" w:after="100" w:afterAutospacing="1" w:line="240" w:lineRule="auto"/>
         <w:rPr>
-          <w:rFonts w:ascii="Times New Roman" w:eastAsia="Times New Roman" w:hAnsi="Times New Roman" w:cs="Times New Roman"/>
-          <w:sz w:val="24"/>
-          <w:szCs w:val="24"/>
+          <w:rFonts w:eastAsia="Times New Roman" w:cstheme="minorHAnsi"/>
           <w:lang w:eastAsia="en-IN"/>
         </w:rPr>
       </w:pPr>
@@ -1346,9 +1080,7 @@
         </w:numPr>
         <w:spacing w:before="100" w:beforeAutospacing="1" w:after="100" w:afterAutospacing="1" w:line="240" w:lineRule="auto"/>
         <w:rPr>
-          <w:rFonts w:ascii="Times New Roman" w:eastAsia="Times New Roman" w:hAnsi="Times New Roman" w:cs="Times New Roman"/>
-          <w:sz w:val="24"/>
-          <w:szCs w:val="24"/>
+          <w:rFonts w:eastAsia="Times New Roman" w:cstheme="minorHAnsi"/>
           <w:lang w:eastAsia="en-IN"/>
         </w:rPr>
       </w:pPr>
@@ -1361,9 +1093,7 @@
         </w:numPr>
         <w:spacing w:before="100" w:beforeAutospacing="1" w:after="100" w:afterAutospacing="1" w:line="240" w:lineRule="auto"/>
         <w:rPr>
-          <w:rFonts w:ascii="Times New Roman" w:eastAsia="Times New Roman" w:hAnsi="Times New Roman" w:cs="Times New Roman"/>
-          <w:sz w:val="24"/>
-          <w:szCs w:val="24"/>
+          <w:rFonts w:eastAsia="Times New Roman" w:cstheme="minorHAnsi"/>
           <w:lang w:eastAsia="en-IN"/>
         </w:rPr>
       </w:pPr>
@@ -1376,9 +1106,7 @@
         </w:numPr>
         <w:spacing w:before="100" w:beforeAutospacing="1" w:after="100" w:afterAutospacing="1" w:line="240" w:lineRule="auto"/>
         <w:rPr>
-          <w:rFonts w:ascii="Times New Roman" w:eastAsia="Times New Roman" w:hAnsi="Times New Roman" w:cs="Times New Roman"/>
-          <w:sz w:val="24"/>
-          <w:szCs w:val="24"/>
+          <w:rFonts w:eastAsia="Times New Roman" w:cstheme="minorHAnsi"/>
           <w:lang w:eastAsia="en-IN"/>
         </w:rPr>
       </w:pPr>
@@ -1391,28 +1119,22 @@
         </w:numPr>
         <w:spacing w:before="100" w:beforeAutospacing="1" w:after="100" w:afterAutospacing="1" w:line="240" w:lineRule="auto"/>
         <w:rPr>
-          <w:rFonts w:ascii="Times New Roman" w:eastAsia="Times New Roman" w:hAnsi="Times New Roman" w:cs="Times New Roman"/>
-          <w:sz w:val="24"/>
-          <w:szCs w:val="24"/>
-          <w:lang w:eastAsia="en-IN"/>
-        </w:rPr>
-      </w:pPr>
-    </w:p>
-    <w:p>
-      <w:pPr>
-        <w:spacing w:before="100" w:beforeAutospacing="1" w:after="100" w:afterAutospacing="1" w:line="240" w:lineRule="auto"/>
-        <w:rPr>
-          <w:rFonts w:ascii="Times New Roman" w:eastAsia="Times New Roman" w:hAnsi="Times New Roman" w:cs="Times New Roman"/>
-          <w:sz w:val="24"/>
-          <w:szCs w:val="24"/>
-          <w:lang w:eastAsia="en-IN"/>
-        </w:rPr>
-      </w:pPr>
-      <w:r>
-        <w:rPr>
-          <w:rFonts w:ascii="Times New Roman" w:eastAsia="Times New Roman" w:hAnsi="Times New Roman" w:cs="Times New Roman"/>
-          <w:sz w:val="24"/>
-          <w:szCs w:val="24"/>
+          <w:rFonts w:eastAsia="Times New Roman" w:cstheme="minorHAnsi"/>
+          <w:lang w:eastAsia="en-IN"/>
+        </w:rPr>
+      </w:pPr>
+    </w:p>
+    <w:p>
+      <w:pPr>
+        <w:spacing w:before="100" w:beforeAutospacing="1" w:after="100" w:afterAutospacing="1" w:line="240" w:lineRule="auto"/>
+        <w:rPr>
+          <w:rFonts w:eastAsia="Times New Roman" w:cstheme="minorHAnsi"/>
+          <w:lang w:eastAsia="en-IN"/>
+        </w:rPr>
+      </w:pPr>
+      <w:r>
+        <w:rPr>
+          <w:rFonts w:eastAsia="Times New Roman" w:cstheme="minorHAnsi"/>
           <w:lang w:eastAsia="en-IN"/>
         </w:rPr>
         <w:t>KNOWLEDGE POINT 1</w:t>
@@ -1422,17 +1144,13 @@
       <w:pPr>
         <w:spacing w:before="100" w:beforeAutospacing="1" w:after="100" w:afterAutospacing="1" w:line="240" w:lineRule="auto"/>
         <w:rPr>
-          <w:rFonts w:ascii="Times New Roman" w:eastAsia="Times New Roman" w:hAnsi="Times New Roman" w:cs="Times New Roman"/>
-          <w:sz w:val="24"/>
-          <w:szCs w:val="24"/>
-          <w:lang w:eastAsia="en-IN"/>
-        </w:rPr>
-      </w:pPr>
-      <w:r>
-        <w:rPr>
-          <w:rFonts w:ascii="Times New Roman" w:eastAsia="Times New Roman" w:hAnsi="Times New Roman" w:cs="Times New Roman"/>
-          <w:sz w:val="24"/>
-          <w:szCs w:val="24"/>
+          <w:rFonts w:eastAsia="Times New Roman" w:cstheme="minorHAnsi"/>
+          <w:lang w:eastAsia="en-IN"/>
+        </w:rPr>
+      </w:pPr>
+      <w:r>
+        <w:rPr>
+          <w:rFonts w:eastAsia="Times New Roman" w:cstheme="minorHAnsi"/>
           <w:lang w:eastAsia="en-IN"/>
         </w:rPr>
         <w:t>KNOWLEDGE POINT 2</w:t>
@@ -1442,17 +1160,13 @@
       <w:pPr>
         <w:spacing w:before="100" w:beforeAutospacing="1" w:after="100" w:afterAutospacing="1" w:line="240" w:lineRule="auto"/>
         <w:rPr>
-          <w:rFonts w:ascii="Times New Roman" w:eastAsia="Times New Roman" w:hAnsi="Times New Roman" w:cs="Times New Roman"/>
-          <w:sz w:val="24"/>
-          <w:szCs w:val="24"/>
-          <w:lang w:eastAsia="en-IN"/>
-        </w:rPr>
-      </w:pPr>
-      <w:r>
-        <w:rPr>
-          <w:rFonts w:ascii="Times New Roman" w:eastAsia="Times New Roman" w:hAnsi="Times New Roman" w:cs="Times New Roman"/>
-          <w:sz w:val="24"/>
-          <w:szCs w:val="24"/>
+          <w:rFonts w:eastAsia="Times New Roman" w:cstheme="minorHAnsi"/>
+          <w:lang w:eastAsia="en-IN"/>
+        </w:rPr>
+      </w:pPr>
+      <w:r>
+        <w:rPr>
+          <w:rFonts w:eastAsia="Times New Roman" w:cstheme="minorHAnsi"/>
           <w:lang w:eastAsia="en-IN"/>
         </w:rPr>
         <w:t>KNOWLEDGE POINT 3</w:t>
@@ -1462,17 +1176,13 @@
       <w:pPr>
         <w:spacing w:before="100" w:beforeAutospacing="1" w:after="100" w:afterAutospacing="1" w:line="240" w:lineRule="auto"/>
         <w:rPr>
-          <w:rFonts w:ascii="Times New Roman" w:eastAsia="Times New Roman" w:hAnsi="Times New Roman" w:cs="Times New Roman"/>
-          <w:sz w:val="24"/>
-          <w:szCs w:val="24"/>
-          <w:lang w:eastAsia="en-IN"/>
-        </w:rPr>
-      </w:pPr>
-      <w:r>
-        <w:rPr>
-          <w:rFonts w:ascii="Times New Roman" w:eastAsia="Times New Roman" w:hAnsi="Times New Roman" w:cs="Times New Roman"/>
-          <w:sz w:val="24"/>
-          <w:szCs w:val="24"/>
+          <w:rFonts w:eastAsia="Times New Roman" w:cstheme="minorHAnsi"/>
+          <w:lang w:eastAsia="en-IN"/>
+        </w:rPr>
+      </w:pPr>
+      <w:r>
+        <w:rPr>
+          <w:rFonts w:eastAsia="Times New Roman" w:cstheme="minorHAnsi"/>
           <w:lang w:eastAsia="en-IN"/>
         </w:rPr>
         <w:t>KNOWLEDGE POINT 4</w:t>
@@ -1482,17 +1192,13 @@
       <w:pPr>
         <w:spacing w:before="100" w:beforeAutospacing="1" w:after="100" w:afterAutospacing="1" w:line="240" w:lineRule="auto"/>
         <w:rPr>
-          <w:rFonts w:ascii="Times New Roman" w:eastAsia="Times New Roman" w:hAnsi="Times New Roman" w:cs="Times New Roman"/>
-          <w:sz w:val="24"/>
-          <w:szCs w:val="24"/>
-          <w:lang w:eastAsia="en-IN"/>
-        </w:rPr>
-      </w:pPr>
-      <w:r>
-        <w:rPr>
-          <w:rFonts w:ascii="Times New Roman" w:eastAsia="Times New Roman" w:hAnsi="Times New Roman" w:cs="Times New Roman"/>
-          <w:sz w:val="24"/>
-          <w:szCs w:val="24"/>
+          <w:rFonts w:eastAsia="Times New Roman" w:cstheme="minorHAnsi"/>
+          <w:lang w:eastAsia="en-IN"/>
+        </w:rPr>
+      </w:pPr>
+      <w:r>
+        <w:rPr>
+          <w:rFonts w:eastAsia="Times New Roman" w:cstheme="minorHAnsi"/>
           <w:lang w:eastAsia="en-IN"/>
         </w:rPr>
         <w:t>KNOWLEDGE POINT 5</w:t>
@@ -1502,17 +1208,13 @@
       <w:pPr>
         <w:spacing w:before="100" w:beforeAutospacing="1" w:after="100" w:afterAutospacing="1" w:line="240" w:lineRule="auto"/>
         <w:rPr>
-          <w:rFonts w:ascii="Times New Roman" w:eastAsia="Times New Roman" w:hAnsi="Times New Roman" w:cs="Times New Roman"/>
-          <w:sz w:val="24"/>
-          <w:szCs w:val="24"/>
-          <w:lang w:eastAsia="en-IN"/>
-        </w:rPr>
-      </w:pPr>
-      <w:r>
-        <w:rPr>
-          <w:rFonts w:ascii="Times New Roman" w:eastAsia="Times New Roman" w:hAnsi="Times New Roman" w:cs="Times New Roman"/>
-          <w:sz w:val="24"/>
-          <w:szCs w:val="24"/>
+          <w:rFonts w:eastAsia="Times New Roman" w:cstheme="minorHAnsi"/>
+          <w:lang w:eastAsia="en-IN"/>
+        </w:rPr>
+      </w:pPr>
+      <w:r>
+        <w:rPr>
+          <w:rFonts w:eastAsia="Times New Roman" w:cstheme="minorHAnsi"/>
           <w:lang w:eastAsia="en-IN"/>
         </w:rPr>
         <w:t>QUICK FACTS</w:t>
@@ -1522,17 +1224,13 @@
       <w:pPr>
         <w:spacing w:before="100" w:beforeAutospacing="1" w:after="100" w:afterAutospacing="1" w:line="240" w:lineRule="auto"/>
         <w:rPr>
-          <w:rFonts w:ascii="Times New Roman" w:eastAsia="Times New Roman" w:hAnsi="Times New Roman" w:cs="Times New Roman"/>
-          <w:sz w:val="24"/>
-          <w:szCs w:val="24"/>
-          <w:lang w:eastAsia="en-IN"/>
-        </w:rPr>
-      </w:pPr>
-      <w:r>
-        <w:rPr>
-          <w:rFonts w:ascii="Times New Roman" w:eastAsia="Times New Roman" w:hAnsi="Times New Roman" w:cs="Times New Roman"/>
-          <w:sz w:val="24"/>
-          <w:szCs w:val="24"/>
+          <w:rFonts w:eastAsia="Times New Roman" w:cstheme="minorHAnsi"/>
+          <w:lang w:eastAsia="en-IN"/>
+        </w:rPr>
+      </w:pPr>
+      <w:r>
+        <w:rPr>
+          <w:rFonts w:eastAsia="Times New Roman" w:cstheme="minorHAnsi"/>
           <w:lang w:eastAsia="en-IN"/>
         </w:rPr>
         <w:t>KEY TAKEAWAY</w:t>
@@ -1542,17 +1240,13 @@
       <w:pPr>
         <w:spacing w:before="100" w:beforeAutospacing="1" w:after="100" w:afterAutospacing="1" w:line="240" w:lineRule="auto"/>
         <w:rPr>
-          <w:rFonts w:ascii="Times New Roman" w:eastAsia="Times New Roman" w:hAnsi="Times New Roman" w:cs="Times New Roman"/>
-          <w:sz w:val="24"/>
-          <w:szCs w:val="24"/>
-          <w:lang w:eastAsia="en-IN"/>
-        </w:rPr>
-      </w:pPr>
-      <w:r>
-        <w:rPr>
-          <w:rFonts w:ascii="Times New Roman" w:eastAsia="Times New Roman" w:hAnsi="Times New Roman" w:cs="Times New Roman"/>
-          <w:sz w:val="24"/>
-          <w:szCs w:val="24"/>
+          <w:rFonts w:eastAsia="Times New Roman" w:cstheme="minorHAnsi"/>
+          <w:lang w:eastAsia="en-IN"/>
+        </w:rPr>
+      </w:pPr>
+      <w:r>
+        <w:rPr>
+          <w:rFonts w:eastAsia="Times New Roman" w:cstheme="minorHAnsi"/>
           <w:lang w:eastAsia="en-IN"/>
         </w:rPr>
         <w:t>MAINS QUESTION</w:t>
@@ -1562,17 +1256,13 @@
       <w:pPr>
         <w:spacing w:before="100" w:beforeAutospacing="1" w:after="100" w:afterAutospacing="1" w:line="240" w:lineRule="auto"/>
         <w:rPr>
-          <w:rFonts w:ascii="Times New Roman" w:eastAsia="Times New Roman" w:hAnsi="Times New Roman" w:cs="Times New Roman"/>
-          <w:sz w:val="24"/>
-          <w:szCs w:val="24"/>
-          <w:lang w:eastAsia="en-IN"/>
-        </w:rPr>
-      </w:pPr>
-      <w:r>
-        <w:rPr>
-          <w:rFonts w:ascii="Times New Roman" w:eastAsia="Times New Roman" w:hAnsi="Times New Roman" w:cs="Times New Roman"/>
-          <w:sz w:val="24"/>
-          <w:szCs w:val="24"/>
+          <w:rFonts w:eastAsia="Times New Roman" w:cstheme="minorHAnsi"/>
+          <w:lang w:eastAsia="en-IN"/>
+        </w:rPr>
+      </w:pPr>
+      <w:r>
+        <w:rPr>
+          <w:rFonts w:eastAsia="Times New Roman" w:cstheme="minorHAnsi"/>
           <w:lang w:eastAsia="en-IN"/>
         </w:rPr>
         <w:t>MAINS ANSWER</w:t>
@@ -1582,17 +1272,13 @@
       <w:pPr>
         <w:spacing w:before="100" w:beforeAutospacing="1" w:after="100" w:afterAutospacing="1" w:line="240" w:lineRule="auto"/>
         <w:rPr>
-          <w:rFonts w:ascii="Times New Roman" w:eastAsia="Times New Roman" w:hAnsi="Times New Roman" w:cs="Times New Roman"/>
-          <w:sz w:val="24"/>
-          <w:szCs w:val="24"/>
-          <w:lang w:eastAsia="en-IN"/>
-        </w:rPr>
-      </w:pPr>
-      <w:r>
-        <w:rPr>
-          <w:rFonts w:ascii="Times New Roman" w:eastAsia="Times New Roman" w:hAnsi="Times New Roman" w:cs="Times New Roman"/>
-          <w:sz w:val="24"/>
-          <w:szCs w:val="24"/>
+          <w:rFonts w:eastAsia="Times New Roman" w:cstheme="minorHAnsi"/>
+          <w:lang w:eastAsia="en-IN"/>
+        </w:rPr>
+      </w:pPr>
+      <w:r>
+        <w:rPr>
+          <w:rFonts w:eastAsia="Times New Roman" w:cstheme="minorHAnsi"/>
           <w:lang w:eastAsia="en-IN"/>
         </w:rPr>
         <w:t>DAILY MCQ 1</w:t>
@@ -1602,17 +1288,13 @@
       <w:pPr>
         <w:spacing w:before="100" w:beforeAutospacing="1" w:after="100" w:afterAutospacing="1" w:line="240" w:lineRule="auto"/>
         <w:rPr>
-          <w:rFonts w:ascii="Times New Roman" w:eastAsia="Times New Roman" w:hAnsi="Times New Roman" w:cs="Times New Roman"/>
-          <w:sz w:val="24"/>
-          <w:szCs w:val="24"/>
-          <w:lang w:eastAsia="en-IN"/>
-        </w:rPr>
-      </w:pPr>
-      <w:r>
-        <w:rPr>
-          <w:rFonts w:ascii="Times New Roman" w:eastAsia="Times New Roman" w:hAnsi="Times New Roman" w:cs="Times New Roman"/>
-          <w:sz w:val="24"/>
-          <w:szCs w:val="24"/>
+          <w:rFonts w:eastAsia="Times New Roman" w:cstheme="minorHAnsi"/>
+          <w:lang w:eastAsia="en-IN"/>
+        </w:rPr>
+      </w:pPr>
+      <w:r>
+        <w:rPr>
+          <w:rFonts w:eastAsia="Times New Roman" w:cstheme="minorHAnsi"/>
           <w:lang w:eastAsia="en-IN"/>
         </w:rPr>
         <w:t>DAILY MCQ 2</w:t>
@@ -1622,17 +1304,13 @@
       <w:pPr>
         <w:spacing w:before="100" w:beforeAutospacing="1" w:after="100" w:afterAutospacing="1" w:line="240" w:lineRule="auto"/>
         <w:rPr>
-          <w:rFonts w:ascii="Times New Roman" w:eastAsia="Times New Roman" w:hAnsi="Times New Roman" w:cs="Times New Roman"/>
-          <w:sz w:val="24"/>
-          <w:szCs w:val="24"/>
-          <w:lang w:eastAsia="en-IN"/>
-        </w:rPr>
-      </w:pPr>
-      <w:r>
-        <w:rPr>
-          <w:rFonts w:ascii="Times New Roman" w:eastAsia="Times New Roman" w:hAnsi="Times New Roman" w:cs="Times New Roman"/>
-          <w:sz w:val="24"/>
-          <w:szCs w:val="24"/>
+          <w:rFonts w:eastAsia="Times New Roman" w:cstheme="minorHAnsi"/>
+          <w:lang w:eastAsia="en-IN"/>
+        </w:rPr>
+      </w:pPr>
+      <w:r>
+        <w:rPr>
+          <w:rFonts w:eastAsia="Times New Roman" w:cstheme="minorHAnsi"/>
           <w:lang w:eastAsia="en-IN"/>
         </w:rPr>
         <w:t>DAILY MCQ 3</w:t>
@@ -1642,17 +1320,13 @@
       <w:pPr>
         <w:spacing w:before="100" w:beforeAutospacing="1" w:after="100" w:afterAutospacing="1" w:line="240" w:lineRule="auto"/>
         <w:rPr>
-          <w:rFonts w:ascii="Times New Roman" w:eastAsia="Times New Roman" w:hAnsi="Times New Roman" w:cs="Times New Roman"/>
-          <w:sz w:val="24"/>
-          <w:szCs w:val="24"/>
-          <w:lang w:eastAsia="en-IN"/>
-        </w:rPr>
-      </w:pPr>
-      <w:r>
-        <w:rPr>
-          <w:rFonts w:ascii="Times New Roman" w:eastAsia="Times New Roman" w:hAnsi="Times New Roman" w:cs="Times New Roman"/>
-          <w:sz w:val="24"/>
-          <w:szCs w:val="24"/>
+          <w:rFonts w:eastAsia="Times New Roman" w:cstheme="minorHAnsi"/>
+          <w:lang w:eastAsia="en-IN"/>
+        </w:rPr>
+      </w:pPr>
+      <w:r>
+        <w:rPr>
+          <w:rFonts w:eastAsia="Times New Roman" w:cstheme="minorHAnsi"/>
           <w:lang w:eastAsia="en-IN"/>
         </w:rPr>
         <w:t>END TOPIC</w:t>
@@ -1662,111 +1336,80 @@
       <w:pPr>
         <w:spacing w:before="100" w:beforeAutospacing="1" w:after="100" w:afterAutospacing="1" w:line="240" w:lineRule="auto"/>
         <w:rPr>
-          <w:rFonts w:ascii="Times New Roman" w:eastAsia="Times New Roman" w:hAnsi="Times New Roman" w:cs="Times New Roman"/>
-          <w:sz w:val="24"/>
-          <w:szCs w:val="24"/>
-          <w:lang w:eastAsia="en-IN"/>
-        </w:rPr>
-      </w:pPr>
-      <w:r>
-        <w:rPr>
-          <w:rFonts w:ascii="Times New Roman" w:eastAsia="Times New Roman" w:hAnsi="Times New Roman" w:cs="Times New Roman"/>
-          <w:sz w:val="24"/>
-          <w:szCs w:val="24"/>
+          <w:rFonts w:eastAsia="Times New Roman" w:cstheme="minorHAnsi"/>
+          <w:lang w:eastAsia="en-IN"/>
+        </w:rPr>
+      </w:pPr>
+      <w:r>
+        <w:rPr>
+          <w:rFonts w:eastAsia="Times New Roman" w:cstheme="minorHAnsi"/>
+          <w:lang w:eastAsia="en-IN"/>
+        </w:rPr>
+        <w:t>Follow this structure exactly for every selected topic.</w:t>
+      </w:r>
+    </w:p>
+    <w:p>
+      <w:pPr>
+        <w:spacing w:before="100" w:beforeAutospacing="1" w:after="100" w:afterAutospacing="1" w:line="240" w:lineRule="auto"/>
+        <w:rPr>
+          <w:rFonts w:eastAsia="Times New Roman" w:cstheme="minorHAnsi"/>
+          <w:lang w:eastAsia="en-IN"/>
+        </w:rPr>
+      </w:pPr>
+      <w:r>
+        <w:rPr>
+          <w:rFonts w:eastAsia="Times New Roman" w:cstheme="minorHAnsi"/>
+          <w:lang w:eastAsia="en-IN"/>
+        </w:rPr>
+        <w:t>Do not change the order of sections.</w:t>
+      </w:r>
+    </w:p>
+    <w:p>
+      <w:pPr>
+        <w:spacing w:before="100" w:beforeAutospacing="1" w:after="100" w:afterAutospacing="1" w:line="240" w:lineRule="auto"/>
+        <w:rPr>
+          <w:rFonts w:eastAsia="Times New Roman" w:cstheme="minorHAnsi"/>
+          <w:lang w:eastAsia="en-IN"/>
+        </w:rPr>
+      </w:pPr>
+      <w:r>
+        <w:rPr>
+          <w:rFonts w:eastAsia="Times New Roman" w:cstheme="minorHAnsi"/>
+          <w:lang w:eastAsia="en-IN"/>
+        </w:rPr>
+        <w:t>Do not omit any mandatory section.</w:t>
+      </w:r>
+    </w:p>
+    <w:p>
+      <w:pPr>
+        <w:spacing w:before="100" w:beforeAutospacing="1" w:after="100" w:afterAutospacing="1" w:line="240" w:lineRule="auto"/>
+        <w:rPr>
+          <w:rFonts w:eastAsia="Times New Roman" w:cstheme="minorHAnsi"/>
+          <w:lang w:eastAsia="en-IN"/>
+        </w:rPr>
+      </w:pPr>
+      <w:r>
+        <w:rPr>
+          <w:rFonts w:eastAsia="Times New Roman" w:cstheme="minorHAnsi"/>
+          <w:lang w:eastAsia="en-IN"/>
+        </w:rPr>
+        <w:t>Do not insert additional headings, subheadings, notes, explanations, markdown formatting, commentary, introductory text or concluding remarks.</w:t>
+      </w:r>
+    </w:p>
+    <w:p>
+      <w:pPr>
+        <w:spacing w:before="100" w:beforeAutospacing="1" w:after="100" w:afterAutospacing="1" w:line="240" w:lineRule="auto"/>
+        <w:rPr>
+          <w:rFonts w:eastAsia="Times New Roman" w:cstheme="minorHAnsi"/>
+          <w:lang w:eastAsia="en-IN"/>
+        </w:rPr>
+      </w:pPr>
+      <w:r>
+        <w:rPr>
+          <w:rFonts w:eastAsia="Times New Roman" w:cstheme="minorHAnsi"/>
           <w:lang w:eastAsia="en-IN"/>
         </w:rPr>
         <w:lastRenderedPageBreak/>
-        <w:t>Follow this structure exactly for every selected topic.</w:t>
-      </w:r>
-    </w:p>
-    <w:p>
-      <w:pPr>
-        <w:spacing w:before="100" w:beforeAutospacing="1" w:after="100" w:afterAutospacing="1" w:line="240" w:lineRule="auto"/>
-        <w:rPr>
-          <w:rFonts w:ascii="Times New Roman" w:eastAsia="Times New Roman" w:hAnsi="Times New Roman" w:cs="Times New Roman"/>
-          <w:sz w:val="24"/>
-          <w:szCs w:val="24"/>
-          <w:lang w:eastAsia="en-IN"/>
-        </w:rPr>
-      </w:pPr>
-      <w:r>
-        <w:rPr>
-          <w:rFonts w:ascii="Times New Roman" w:eastAsia="Times New Roman" w:hAnsi="Times New Roman" w:cs="Times New Roman"/>
-          <w:sz w:val="24"/>
-          <w:szCs w:val="24"/>
-          <w:lang w:eastAsia="en-IN"/>
-        </w:rPr>
-        <w:t>Do not change the order of sections.</w:t>
-      </w:r>
-    </w:p>
-    <w:p>
-      <w:pPr>
-        <w:spacing w:before="100" w:beforeAutospacing="1" w:after="100" w:afterAutospacing="1" w:line="240" w:lineRule="auto"/>
-        <w:rPr>
-          <w:rFonts w:ascii="Times New Roman" w:eastAsia="Times New Roman" w:hAnsi="Times New Roman" w:cs="Times New Roman"/>
-          <w:sz w:val="24"/>
-          <w:szCs w:val="24"/>
-          <w:lang w:eastAsia="en-IN"/>
-        </w:rPr>
-      </w:pPr>
-      <w:r>
-        <w:rPr>
-          <w:rFonts w:ascii="Times New Roman" w:eastAsia="Times New Roman" w:hAnsi="Times New Roman" w:cs="Times New Roman"/>
-          <w:sz w:val="24"/>
-          <w:szCs w:val="24"/>
-          <w:lang w:eastAsia="en-IN"/>
-        </w:rPr>
-        <w:t>Do not omit any mandatory section.</w:t>
-      </w:r>
-    </w:p>
-    <w:p>
-      <w:pPr>
-        <w:spacing w:before="100" w:beforeAutospacing="1" w:after="100" w:afterAutospacing="1" w:line="240" w:lineRule="auto"/>
-        <w:rPr>
-          <w:rFonts w:ascii="Times New Roman" w:eastAsia="Times New Roman" w:hAnsi="Times New Roman" w:cs="Times New Roman"/>
-          <w:sz w:val="24"/>
-          <w:szCs w:val="24"/>
-          <w:lang w:eastAsia="en-IN"/>
-        </w:rPr>
-      </w:pPr>
-      <w:r>
-        <w:rPr>
-          <w:rFonts w:ascii="Times New Roman" w:eastAsia="Times New Roman" w:hAnsi="Times New Roman" w:cs="Times New Roman"/>
-          <w:sz w:val="24"/>
-          <w:szCs w:val="24"/>
-          <w:lang w:eastAsia="en-IN"/>
-        </w:rPr>
-        <w:t>Do not insert additional headings, subheadings, notes, e</w:t>
-      </w:r>
-      <w:bookmarkStart w:id="0" w:name="_GoBack"/>
-      <w:bookmarkEnd w:id="0"/>
-      <w:r>
-        <w:rPr>
-          <w:rFonts w:ascii="Times New Roman" w:eastAsia="Times New Roman" w:hAnsi="Times New Roman" w:cs="Times New Roman"/>
-          <w:sz w:val="24"/>
-          <w:szCs w:val="24"/>
-          <w:lang w:eastAsia="en-IN"/>
-        </w:rPr>
-        <w:t>xplanations, markdown formatting, commentary, introductory text or concluding remarks.</w:t>
-      </w:r>
-    </w:p>
-    <w:p>
-      <w:pPr>
-        <w:spacing w:before="100" w:beforeAutospacing="1" w:after="100" w:afterAutospacing="1" w:line="240" w:lineRule="auto"/>
-        <w:rPr>
-          <w:rFonts w:ascii="Times New Roman" w:eastAsia="Times New Roman" w:hAnsi="Times New Roman" w:cs="Times New Roman"/>
-          <w:sz w:val="24"/>
-          <w:szCs w:val="24"/>
-          <w:lang w:eastAsia="en-IN"/>
-        </w:rPr>
-      </w:pPr>
-      <w:r>
-        <w:rPr>
-          <w:rFonts w:ascii="Times New Roman" w:eastAsia="Times New Roman" w:hAnsi="Times New Roman" w:cs="Times New Roman"/>
-          <w:sz w:val="24"/>
-          <w:szCs w:val="24"/>
-          <w:lang w:eastAsia="en-IN"/>
-        </w:rPr>
         <w:t>Do not use bold, italics, Markdown heading symbols, horizontal rules, tables or other decorative formatting in the final output.</w:t>
       </w:r>
     </w:p>
@@ -1774,17 +1417,13 @@
       <w:pPr>
         <w:spacing w:before="100" w:beforeAutospacing="1" w:after="100" w:afterAutospacing="1" w:line="240" w:lineRule="auto"/>
         <w:rPr>
-          <w:rFonts w:ascii="Times New Roman" w:eastAsia="Times New Roman" w:hAnsi="Times New Roman" w:cs="Times New Roman"/>
-          <w:sz w:val="24"/>
-          <w:szCs w:val="24"/>
-          <w:lang w:eastAsia="en-IN"/>
-        </w:rPr>
-      </w:pPr>
-      <w:r>
-        <w:rPr>
-          <w:rFonts w:ascii="Times New Roman" w:eastAsia="Times New Roman" w:hAnsi="Times New Roman" w:cs="Times New Roman"/>
-          <w:sz w:val="24"/>
-          <w:szCs w:val="24"/>
+          <w:rFonts w:eastAsia="Times New Roman" w:cstheme="minorHAnsi"/>
+          <w:lang w:eastAsia="en-IN"/>
+        </w:rPr>
+      </w:pPr>
+      <w:r>
+        <w:rPr>
+          <w:rFonts w:eastAsia="Times New Roman" w:cstheme="minorHAnsi"/>
           <w:lang w:eastAsia="en-IN"/>
         </w:rPr>
         <w:t>Under each mandatory section heading, place only the corresponding selected or generated content. Knowledge Point headings, Quick Facts, Mains Answer components, MCQ questions, options, answers and explanations must appear as content within their designated sections without creating additional section-level headings.</w:t>
@@ -1794,17 +1433,13 @@
       <w:pPr>
         <w:spacing w:before="100" w:beforeAutospacing="1" w:after="100" w:afterAutospacing="1" w:line="240" w:lineRule="auto"/>
         <w:rPr>
-          <w:rFonts w:ascii="Times New Roman" w:eastAsia="Times New Roman" w:hAnsi="Times New Roman" w:cs="Times New Roman"/>
-          <w:sz w:val="24"/>
-          <w:szCs w:val="24"/>
-          <w:lang w:eastAsia="en-IN"/>
-        </w:rPr>
-      </w:pPr>
-      <w:r>
-        <w:rPr>
-          <w:rFonts w:ascii="Times New Roman" w:eastAsia="Times New Roman" w:hAnsi="Times New Roman" w:cs="Times New Roman"/>
-          <w:sz w:val="24"/>
-          <w:szCs w:val="24"/>
+          <w:rFonts w:eastAsia="Times New Roman" w:cstheme="minorHAnsi"/>
+          <w:lang w:eastAsia="en-IN"/>
+        </w:rPr>
+      </w:pPr>
+      <w:r>
+        <w:rPr>
+          <w:rFonts w:eastAsia="Times New Roman" w:cstheme="minorHAnsi"/>
           <w:lang w:eastAsia="en-IN"/>
         </w:rPr>
         <w:t>RECALL ANCHORS must contain exactly the five anchors selected by the user, numbered 1 through 5.</w:t>
@@ -1814,17 +1449,13 @@
       <w:pPr>
         <w:spacing w:before="100" w:beforeAutospacing="1" w:after="100" w:afterAutospacing="1" w:line="240" w:lineRule="auto"/>
         <w:rPr>
-          <w:rFonts w:ascii="Times New Roman" w:eastAsia="Times New Roman" w:hAnsi="Times New Roman" w:cs="Times New Roman"/>
-          <w:sz w:val="24"/>
-          <w:szCs w:val="24"/>
-          <w:lang w:eastAsia="en-IN"/>
-        </w:rPr>
-      </w:pPr>
-      <w:r>
-        <w:rPr>
-          <w:rFonts w:ascii="Times New Roman" w:eastAsia="Times New Roman" w:hAnsi="Times New Roman" w:cs="Times New Roman"/>
-          <w:sz w:val="24"/>
-          <w:szCs w:val="24"/>
+          <w:rFonts w:eastAsia="Times New Roman" w:cstheme="minorHAnsi"/>
+          <w:lang w:eastAsia="en-IN"/>
+        </w:rPr>
+      </w:pPr>
+      <w:r>
+        <w:rPr>
+          <w:rFonts w:eastAsia="Times New Roman" w:cstheme="minorHAnsi"/>
           <w:lang w:eastAsia="en-IN"/>
         </w:rPr>
         <w:t>KNOWLEDGE POINT 1 through KNOWLEDGE POINT 5 must contain the five selected Knowledge Points, preserving their selected content.</w:t>
@@ -1834,17 +1465,13 @@
       <w:pPr>
         <w:spacing w:before="100" w:beforeAutospacing="1" w:after="100" w:afterAutospacing="1" w:line="240" w:lineRule="auto"/>
         <w:rPr>
-          <w:rFonts w:ascii="Times New Roman" w:eastAsia="Times New Roman" w:hAnsi="Times New Roman" w:cs="Times New Roman"/>
-          <w:sz w:val="24"/>
-          <w:szCs w:val="24"/>
-          <w:lang w:eastAsia="en-IN"/>
-        </w:rPr>
-      </w:pPr>
-      <w:r>
-        <w:rPr>
-          <w:rFonts w:ascii="Times New Roman" w:eastAsia="Times New Roman" w:hAnsi="Times New Roman" w:cs="Times New Roman"/>
-          <w:sz w:val="24"/>
-          <w:szCs w:val="24"/>
+          <w:rFonts w:eastAsia="Times New Roman" w:cstheme="minorHAnsi"/>
+          <w:lang w:eastAsia="en-IN"/>
+        </w:rPr>
+      </w:pPr>
+      <w:r>
+        <w:rPr>
+          <w:rFonts w:eastAsia="Times New Roman" w:cstheme="minorHAnsi"/>
           <w:lang w:eastAsia="en-IN"/>
         </w:rPr>
         <w:t>QUICK FACTS must contain the four selected Quick Facts.</w:t>
@@ -1854,17 +1481,13 @@
       <w:pPr>
         <w:spacing w:before="100" w:beforeAutospacing="1" w:after="100" w:afterAutospacing="1" w:line="240" w:lineRule="auto"/>
         <w:rPr>
-          <w:rFonts w:ascii="Times New Roman" w:eastAsia="Times New Roman" w:hAnsi="Times New Roman" w:cs="Times New Roman"/>
-          <w:sz w:val="24"/>
-          <w:szCs w:val="24"/>
-          <w:lang w:eastAsia="en-IN"/>
-        </w:rPr>
-      </w:pPr>
-      <w:r>
-        <w:rPr>
-          <w:rFonts w:ascii="Times New Roman" w:eastAsia="Times New Roman" w:hAnsi="Times New Roman" w:cs="Times New Roman"/>
-          <w:sz w:val="24"/>
-          <w:szCs w:val="24"/>
+          <w:rFonts w:eastAsia="Times New Roman" w:cstheme="minorHAnsi"/>
+          <w:lang w:eastAsia="en-IN"/>
+        </w:rPr>
+      </w:pPr>
+      <w:r>
+        <w:rPr>
+          <w:rFonts w:eastAsia="Times New Roman" w:cstheme="minorHAnsi"/>
           <w:lang w:eastAsia="en-IN"/>
         </w:rPr>
         <w:t>MAINS ANSWER must contain the complete answer generated for the selected Mains Question. The Introduction, Body and Conclusion may be separated into paragraphs, but do not add separate INTRODUCTION, BODY or CONCLUSION headings unless explicitly required by the production pipeline.</w:t>
@@ -1874,17 +1497,13 @@
       <w:pPr>
         <w:spacing w:before="100" w:beforeAutospacing="1" w:after="100" w:afterAutospacing="1" w:line="240" w:lineRule="auto"/>
         <w:rPr>
-          <w:rFonts w:ascii="Times New Roman" w:eastAsia="Times New Roman" w:hAnsi="Times New Roman" w:cs="Times New Roman"/>
-          <w:sz w:val="24"/>
-          <w:szCs w:val="24"/>
-          <w:lang w:eastAsia="en-IN"/>
-        </w:rPr>
-      </w:pPr>
-      <w:r>
-        <w:rPr>
-          <w:rFonts w:ascii="Times New Roman" w:eastAsia="Times New Roman" w:hAnsi="Times New Roman" w:cs="Times New Roman"/>
-          <w:sz w:val="24"/>
-          <w:szCs w:val="24"/>
+          <w:rFonts w:eastAsia="Times New Roman" w:cstheme="minorHAnsi"/>
+          <w:lang w:eastAsia="en-IN"/>
+        </w:rPr>
+      </w:pPr>
+      <w:r>
+        <w:rPr>
+          <w:rFonts w:eastAsia="Times New Roman" w:cstheme="minorHAnsi"/>
           <w:lang w:eastAsia="en-IN"/>
         </w:rPr>
         <w:t>DAILY MCQ 1 through DAILY MCQ 3 must contain only the three MCQs selected by the user. Each MCQ must include its question, options A–D, correct answer and explanation.</w:t>
@@ -1894,17 +1513,13 @@
       <w:pPr>
         <w:spacing w:before="100" w:beforeAutospacing="1" w:after="100" w:afterAutospacing="1" w:line="240" w:lineRule="auto"/>
         <w:rPr>
-          <w:rFonts w:ascii="Times New Roman" w:eastAsia="Times New Roman" w:hAnsi="Times New Roman" w:cs="Times New Roman"/>
-          <w:sz w:val="24"/>
-          <w:szCs w:val="24"/>
-          <w:lang w:eastAsia="en-IN"/>
-        </w:rPr>
-      </w:pPr>
-      <w:r>
-        <w:rPr>
-          <w:rFonts w:ascii="Times New Roman" w:eastAsia="Times New Roman" w:hAnsi="Times New Roman" w:cs="Times New Roman"/>
-          <w:sz w:val="24"/>
-          <w:szCs w:val="24"/>
+          <w:rFonts w:eastAsia="Times New Roman" w:cstheme="minorHAnsi"/>
+          <w:lang w:eastAsia="en-IN"/>
+        </w:rPr>
+      </w:pPr>
+      <w:r>
+        <w:rPr>
+          <w:rFonts w:eastAsia="Times New Roman" w:cstheme="minorHAnsi"/>
           <w:lang w:eastAsia="en-IN"/>
         </w:rPr>
         <w:t xml:space="preserve">Remove all temporary selection-stage metadata from the final output, including option numbers from the selection process, word counts, </w:t>
@@ -1912,9 +1527,7 @@
       <w:proofErr w:type="gramStart"/>
       <w:r>
         <w:rPr>
-          <w:rFonts w:ascii="Times New Roman" w:eastAsia="Times New Roman" w:hAnsi="Times New Roman" w:cs="Times New Roman"/>
-          <w:sz w:val="24"/>
-          <w:szCs w:val="24"/>
+          <w:rFonts w:eastAsia="Times New Roman" w:cstheme="minorHAnsi"/>
           <w:lang w:eastAsia="en-IN"/>
         </w:rPr>
         <w:t>source</w:t>
@@ -1922,9 +1535,7 @@
       <w:proofErr w:type="gramEnd"/>
       <w:r>
         <w:rPr>
-          <w:rFonts w:ascii="Times New Roman" w:eastAsia="Times New Roman" w:hAnsi="Times New Roman" w:cs="Times New Roman"/>
-          <w:sz w:val="24"/>
-          <w:szCs w:val="24"/>
+          <w:rFonts w:eastAsia="Times New Roman" w:cstheme="minorHAnsi"/>
           <w:lang w:eastAsia="en-IN"/>
         </w:rPr>
         <w:t>/type labels in brackets, selection instructions and verification notes.</w:t>
@@ -1934,17 +1545,13 @@
       <w:pPr>
         <w:spacing w:before="100" w:beforeAutospacing="1" w:after="100" w:afterAutospacing="1" w:line="240" w:lineRule="auto"/>
         <w:rPr>
-          <w:rFonts w:ascii="Times New Roman" w:eastAsia="Times New Roman" w:hAnsi="Times New Roman" w:cs="Times New Roman"/>
-          <w:sz w:val="24"/>
-          <w:szCs w:val="24"/>
-          <w:lang w:eastAsia="en-IN"/>
-        </w:rPr>
-      </w:pPr>
-      <w:r>
-        <w:rPr>
-          <w:rFonts w:ascii="Times New Roman" w:eastAsia="Times New Roman" w:hAnsi="Times New Roman" w:cs="Times New Roman"/>
-          <w:sz w:val="24"/>
-          <w:szCs w:val="24"/>
+          <w:rFonts w:eastAsia="Times New Roman" w:cstheme="minorHAnsi"/>
+          <w:lang w:eastAsia="en-IN"/>
+        </w:rPr>
+      </w:pPr>
+      <w:r>
+        <w:rPr>
+          <w:rFonts w:eastAsia="Times New Roman" w:cstheme="minorHAnsi"/>
           <w:lang w:eastAsia="en-IN"/>
         </w:rPr>
         <w:t>Do not regenerate, rewrite or alter content already selected by the user when assembling the final output.</w:t>
@@ -1954,17 +1561,13 @@
       <w:pPr>
         <w:spacing w:before="100" w:beforeAutospacing="1" w:after="100" w:afterAutospacing="1" w:line="240" w:lineRule="auto"/>
         <w:rPr>
-          <w:rFonts w:ascii="Times New Roman" w:eastAsia="Times New Roman" w:hAnsi="Times New Roman" w:cs="Times New Roman"/>
-          <w:sz w:val="24"/>
-          <w:szCs w:val="24"/>
-          <w:lang w:eastAsia="en-IN"/>
-        </w:rPr>
-      </w:pPr>
-      <w:r>
-        <w:rPr>
-          <w:rFonts w:ascii="Times New Roman" w:eastAsia="Times New Roman" w:hAnsi="Times New Roman" w:cs="Times New Roman"/>
-          <w:sz w:val="24"/>
-          <w:szCs w:val="24"/>
+          <w:rFonts w:eastAsia="Times New Roman" w:cstheme="minorHAnsi"/>
+          <w:lang w:eastAsia="en-IN"/>
+        </w:rPr>
+      </w:pPr>
+      <w:r>
+        <w:rPr>
+          <w:rFonts w:eastAsia="Times New Roman" w:cstheme="minorHAnsi"/>
           <w:lang w:eastAsia="en-IN"/>
         </w:rPr>
         <w:t>Every topic must be completely self-contained and ready for direct processing by the downstream production pipeline.</w:t>
@@ -1974,17 +1577,13 @@
       <w:pPr>
         <w:spacing w:before="100" w:beforeAutospacing="1" w:after="100" w:afterAutospacing="1" w:line="240" w:lineRule="auto"/>
         <w:rPr>
-          <w:rFonts w:ascii="Times New Roman" w:eastAsia="Times New Roman" w:hAnsi="Times New Roman" w:cs="Times New Roman"/>
-          <w:sz w:val="24"/>
-          <w:szCs w:val="24"/>
-          <w:lang w:eastAsia="en-IN"/>
-        </w:rPr>
-      </w:pPr>
-      <w:r>
-        <w:rPr>
-          <w:rFonts w:ascii="Times New Roman" w:eastAsia="Times New Roman" w:hAnsi="Times New Roman" w:cs="Times New Roman"/>
-          <w:sz w:val="24"/>
-          <w:szCs w:val="24"/>
+          <w:rFonts w:eastAsia="Times New Roman" w:cstheme="minorHAnsi"/>
+          <w:lang w:eastAsia="en-IN"/>
+        </w:rPr>
+      </w:pPr>
+      <w:r>
+        <w:rPr>
+          <w:rFonts w:eastAsia="Times New Roman" w:cstheme="minorHAnsi"/>
           <w:lang w:eastAsia="en-IN"/>
         </w:rPr>
         <w:t>Before presenting the final topic, internally validate that:</w:t>
@@ -1998,17 +1597,13 @@
         </w:numPr>
         <w:spacing w:before="100" w:beforeAutospacing="1" w:after="100" w:afterAutospacing="1" w:line="240" w:lineRule="auto"/>
         <w:rPr>
-          <w:rFonts w:ascii="Times New Roman" w:eastAsia="Times New Roman" w:hAnsi="Times New Roman" w:cs="Times New Roman"/>
-          <w:sz w:val="24"/>
-          <w:szCs w:val="24"/>
-          <w:lang w:eastAsia="en-IN"/>
-        </w:rPr>
-      </w:pPr>
-      <w:r>
-        <w:rPr>
-          <w:rFonts w:ascii="Times New Roman" w:eastAsia="Times New Roman" w:hAnsi="Times New Roman" w:cs="Times New Roman"/>
-          <w:sz w:val="24"/>
-          <w:szCs w:val="24"/>
+          <w:rFonts w:eastAsia="Times New Roman" w:cstheme="minorHAnsi"/>
+          <w:lang w:eastAsia="en-IN"/>
+        </w:rPr>
+      </w:pPr>
+      <w:r>
+        <w:rPr>
+          <w:rFonts w:eastAsia="Times New Roman" w:cstheme="minorHAnsi"/>
           <w:lang w:eastAsia="en-IN"/>
         </w:rPr>
         <w:t>Every mandatory section is present.</w:t>
@@ -2022,17 +1617,13 @@
         </w:numPr>
         <w:spacing w:before="100" w:beforeAutospacing="1" w:after="100" w:afterAutospacing="1" w:line="240" w:lineRule="auto"/>
         <w:rPr>
-          <w:rFonts w:ascii="Times New Roman" w:eastAsia="Times New Roman" w:hAnsi="Times New Roman" w:cs="Times New Roman"/>
-          <w:sz w:val="24"/>
-          <w:szCs w:val="24"/>
-          <w:lang w:eastAsia="en-IN"/>
-        </w:rPr>
-      </w:pPr>
-      <w:r>
-        <w:rPr>
-          <w:rFonts w:ascii="Times New Roman" w:eastAsia="Times New Roman" w:hAnsi="Times New Roman" w:cs="Times New Roman"/>
-          <w:sz w:val="24"/>
-          <w:szCs w:val="24"/>
+          <w:rFonts w:eastAsia="Times New Roman" w:cstheme="minorHAnsi"/>
+          <w:lang w:eastAsia="en-IN"/>
+        </w:rPr>
+      </w:pPr>
+      <w:r>
+        <w:rPr>
+          <w:rFonts w:eastAsia="Times New Roman" w:cstheme="minorHAnsi"/>
           <w:lang w:eastAsia="en-IN"/>
         </w:rPr>
         <w:t>Sections appear in the exact prescribed order.</w:t>
@@ -2046,17 +1637,13 @@
         </w:numPr>
         <w:spacing w:before="100" w:beforeAutospacing="1" w:after="100" w:afterAutospacing="1" w:line="240" w:lineRule="auto"/>
         <w:rPr>
-          <w:rFonts w:ascii="Times New Roman" w:eastAsia="Times New Roman" w:hAnsi="Times New Roman" w:cs="Times New Roman"/>
-          <w:sz w:val="24"/>
-          <w:szCs w:val="24"/>
-          <w:lang w:eastAsia="en-IN"/>
-        </w:rPr>
-      </w:pPr>
-      <w:r>
-        <w:rPr>
-          <w:rFonts w:ascii="Times New Roman" w:eastAsia="Times New Roman" w:hAnsi="Times New Roman" w:cs="Times New Roman"/>
-          <w:sz w:val="24"/>
-          <w:szCs w:val="24"/>
+          <w:rFonts w:eastAsia="Times New Roman" w:cstheme="minorHAnsi"/>
+          <w:lang w:eastAsia="en-IN"/>
+        </w:rPr>
+      </w:pPr>
+      <w:r>
+        <w:rPr>
+          <w:rFonts w:eastAsia="Times New Roman" w:cstheme="minorHAnsi"/>
           <w:lang w:eastAsia="en-IN"/>
         </w:rPr>
         <w:t>Only user-selected content is included where selection was required.</w:t>
@@ -2070,17 +1657,13 @@
         </w:numPr>
         <w:spacing w:before="100" w:beforeAutospacing="1" w:after="100" w:afterAutospacing="1" w:line="240" w:lineRule="auto"/>
         <w:rPr>
-          <w:rFonts w:ascii="Times New Roman" w:eastAsia="Times New Roman" w:hAnsi="Times New Roman" w:cs="Times New Roman"/>
-          <w:sz w:val="24"/>
-          <w:szCs w:val="24"/>
-          <w:lang w:eastAsia="en-IN"/>
-        </w:rPr>
-      </w:pPr>
-      <w:r>
-        <w:rPr>
-          <w:rFonts w:ascii="Times New Roman" w:eastAsia="Times New Roman" w:hAnsi="Times New Roman" w:cs="Times New Roman"/>
-          <w:sz w:val="24"/>
-          <w:szCs w:val="24"/>
+          <w:rFonts w:eastAsia="Times New Roman" w:cstheme="minorHAnsi"/>
+          <w:lang w:eastAsia="en-IN"/>
+        </w:rPr>
+      </w:pPr>
+      <w:r>
+        <w:rPr>
+          <w:rFonts w:eastAsia="Times New Roman" w:cstheme="minorHAnsi"/>
           <w:lang w:eastAsia="en-IN"/>
         </w:rPr>
         <w:t>No selection metadata remains.</w:t>
@@ -2094,17 +1677,13 @@
         </w:numPr>
         <w:spacing w:before="100" w:beforeAutospacing="1" w:after="100" w:afterAutospacing="1" w:line="240" w:lineRule="auto"/>
         <w:rPr>
-          <w:rFonts w:ascii="Times New Roman" w:eastAsia="Times New Roman" w:hAnsi="Times New Roman" w:cs="Times New Roman"/>
-          <w:sz w:val="24"/>
-          <w:szCs w:val="24"/>
-          <w:lang w:eastAsia="en-IN"/>
-        </w:rPr>
-      </w:pPr>
-      <w:r>
-        <w:rPr>
-          <w:rFonts w:ascii="Times New Roman" w:eastAsia="Times New Roman" w:hAnsi="Times New Roman" w:cs="Times New Roman"/>
-          <w:sz w:val="24"/>
-          <w:szCs w:val="24"/>
+          <w:rFonts w:eastAsia="Times New Roman" w:cstheme="minorHAnsi"/>
+          <w:lang w:eastAsia="en-IN"/>
+        </w:rPr>
+      </w:pPr>
+      <w:r>
+        <w:rPr>
+          <w:rFonts w:eastAsia="Times New Roman" w:cstheme="minorHAnsi"/>
           <w:lang w:eastAsia="en-IN"/>
         </w:rPr>
         <w:t>No additional headings or commentary have been introduced.</w:t>
@@ -2118,20 +1697,15 @@
         </w:numPr>
         <w:spacing w:before="100" w:beforeAutospacing="1" w:after="100" w:afterAutospacing="1" w:line="240" w:lineRule="auto"/>
         <w:rPr>
-          <w:rFonts w:ascii="Times New Roman" w:eastAsia="Times New Roman" w:hAnsi="Times New Roman" w:cs="Times New Roman"/>
-          <w:sz w:val="24"/>
-          <w:szCs w:val="24"/>
-          <w:lang w:eastAsia="en-IN"/>
-        </w:rPr>
-      </w:pPr>
-      <w:r>
-        <w:rPr>
-          <w:rFonts w:ascii="Times New Roman" w:eastAsia="Times New Roman" w:hAnsi="Times New Roman" w:cs="Times New Roman"/>
-          <w:sz w:val="24"/>
-          <w:szCs w:val="24"/>
-          <w:lang w:eastAsia="en-IN"/>
-        </w:rPr>
-        <w:lastRenderedPageBreak/>
+          <w:rFonts w:eastAsia="Times New Roman" w:cstheme="minorHAnsi"/>
+          <w:lang w:eastAsia="en-IN"/>
+        </w:rPr>
+      </w:pPr>
+      <w:r>
+        <w:rPr>
+          <w:rFonts w:eastAsia="Times New Roman" w:cstheme="minorHAnsi"/>
+          <w:lang w:eastAsia="en-IN"/>
+        </w:rPr>
         <w:t>The final output contains no Markdown formatting.</w:t>
       </w:r>
     </w:p>
@@ -2143,17 +1717,13 @@
         </w:numPr>
         <w:spacing w:before="100" w:beforeAutospacing="1" w:after="100" w:afterAutospacing="1" w:line="240" w:lineRule="auto"/>
         <w:rPr>
-          <w:rFonts w:ascii="Times New Roman" w:eastAsia="Times New Roman" w:hAnsi="Times New Roman" w:cs="Times New Roman"/>
-          <w:sz w:val="24"/>
-          <w:szCs w:val="24"/>
-          <w:lang w:eastAsia="en-IN"/>
-        </w:rPr>
-      </w:pPr>
-      <w:r>
-        <w:rPr>
-          <w:rFonts w:ascii="Times New Roman" w:eastAsia="Times New Roman" w:hAnsi="Times New Roman" w:cs="Times New Roman"/>
-          <w:sz w:val="24"/>
-          <w:szCs w:val="24"/>
+          <w:rFonts w:eastAsia="Times New Roman" w:cstheme="minorHAnsi"/>
+          <w:lang w:eastAsia="en-IN"/>
+        </w:rPr>
+      </w:pPr>
+      <w:r>
+        <w:rPr>
+          <w:rFonts w:eastAsia="Times New Roman" w:cstheme="minorHAnsi"/>
           <w:lang w:eastAsia="en-IN"/>
         </w:rPr>
         <w:t>The topic begins with TOPIC X and ends with END TOPIC.</w:t>
@@ -2163,17 +1733,13 @@
       <w:pPr>
         <w:spacing w:before="100" w:beforeAutospacing="1" w:after="100" w:afterAutospacing="1" w:line="240" w:lineRule="auto"/>
         <w:rPr>
-          <w:rFonts w:ascii="Times New Roman" w:eastAsia="Times New Roman" w:hAnsi="Times New Roman" w:cs="Times New Roman"/>
-          <w:sz w:val="24"/>
-          <w:szCs w:val="24"/>
-          <w:lang w:eastAsia="en-IN"/>
-        </w:rPr>
-      </w:pPr>
-      <w:r>
-        <w:rPr>
-          <w:rFonts w:ascii="Times New Roman" w:eastAsia="Times New Roman" w:hAnsi="Times New Roman" w:cs="Times New Roman"/>
-          <w:sz w:val="24"/>
-          <w:szCs w:val="24"/>
+          <w:rFonts w:eastAsia="Times New Roman" w:cstheme="minorHAnsi"/>
+          <w:lang w:eastAsia="en-IN"/>
+        </w:rPr>
+      </w:pPr>
+      <w:r>
+        <w:rPr>
+          <w:rFonts w:eastAsia="Times New Roman" w:cstheme="minorHAnsi"/>
           <w:lang w:eastAsia="en-IN"/>
         </w:rPr>
         <w:t>The final response must contain only the completed topic from TOPIC X through END TOPIC and nothing before or after it.</w:t>
@@ -2182,6 +1748,9 @@
     <w:p>
       <w:pPr>
         <w:spacing w:before="100" w:beforeAutospacing="1" w:after="100" w:afterAutospacing="1" w:line="240" w:lineRule="auto"/>
+        <w:rPr>
+          <w:rFonts w:cstheme="minorHAnsi"/>
+        </w:rPr>
       </w:pPr>
     </w:p>
     <w:sectPr>

</xml_diff>